<commit_message>
Added an example, at the end
</commit_message>
<xml_diff>
--- a/Java_Springboot_high_Memory_UseCases.docx
+++ b/Java_Springboot_high_Memory_UseCases.docx
@@ -18207,93 +18207,90 @@
     </w:p>
     <w:p>
       <w:pPr>
-        <w:rPr>
-          <w:sz w:val="20"/>
-          <w:szCs w:val="20"/>
-        </w:rPr>
-      </w:pPr>
-      <w:r>
-        <w:rPr>
-          <w:sz w:val="20"/>
-          <w:szCs w:val="20"/>
-        </w:rPr>
-        <w:t>// This cache will never exceed 10,000 entries and expires data after 30 mins</w:t>
-      </w:r>
-    </w:p>
-    <w:p>
-      <w:pPr>
-        <w:rPr>
-          <w:sz w:val="20"/>
-          <w:szCs w:val="20"/>
-        </w:rPr>
-      </w:pPr>
-      <w:r>
-        <w:rPr>
-          <w:sz w:val="20"/>
-          <w:szCs w:val="20"/>
+        <w:pStyle w:val="NoSpacing"/>
+        <w:ind w:left="720"/>
+        <w:rPr>
+          <w:color w:val="D0CECE" w:themeColor="background2" w:themeShade="E6"/>
+        </w:rPr>
+      </w:pPr>
+      <w:r>
+        <w:t xml:space="preserve">// </w:t>
+      </w:r>
+      <w:r>
+        <w:rPr>
+          <w:color w:val="D0CECE" w:themeColor="background2" w:themeShade="E6"/>
+        </w:rPr>
+        <w:t>This cache will never exceed 10,000 entries and expires data after 30 mins</w:t>
+      </w:r>
+    </w:p>
+    <w:p>
+      <w:pPr>
+        <w:pStyle w:val="NoSpacing"/>
+        <w:ind w:left="720"/>
+        <w:rPr>
+          <w:color w:val="BF8F00" w:themeColor="accent4" w:themeShade="BF"/>
+        </w:rPr>
+      </w:pPr>
+      <w:r>
+        <w:rPr>
+          <w:color w:val="BF8F00" w:themeColor="accent4" w:themeShade="BF"/>
         </w:rPr>
         <w:t xml:space="preserve">Cache&lt;String, </w:t>
       </w:r>
       <w:proofErr w:type="spellStart"/>
       <w:r>
         <w:rPr>
-          <w:sz w:val="20"/>
-          <w:szCs w:val="20"/>
+          <w:color w:val="BF8F00" w:themeColor="accent4" w:themeShade="BF"/>
         </w:rPr>
         <w:t>PaymentRequest</w:t>
       </w:r>
       <w:proofErr w:type="spellEnd"/>
       <w:r>
         <w:rPr>
-          <w:sz w:val="20"/>
-          <w:szCs w:val="20"/>
+          <w:color w:val="BF8F00" w:themeColor="accent4" w:themeShade="BF"/>
         </w:rPr>
         <w:t xml:space="preserve">&gt; cache = </w:t>
       </w:r>
       <w:proofErr w:type="spellStart"/>
       <w:r>
         <w:rPr>
-          <w:sz w:val="20"/>
-          <w:szCs w:val="20"/>
+          <w:color w:val="BF8F00" w:themeColor="accent4" w:themeShade="BF"/>
         </w:rPr>
         <w:t>Caffeine.newBuilder</w:t>
       </w:r>
       <w:proofErr w:type="spellEnd"/>
       <w:r>
         <w:rPr>
-          <w:sz w:val="20"/>
-          <w:szCs w:val="20"/>
+          <w:color w:val="BF8F00" w:themeColor="accent4" w:themeShade="BF"/>
         </w:rPr>
         <w:t>()</w:t>
       </w:r>
     </w:p>
     <w:p>
       <w:pPr>
-        <w:rPr>
-          <w:sz w:val="20"/>
-          <w:szCs w:val="20"/>
-        </w:rPr>
-      </w:pPr>
-      <w:r>
-        <w:rPr>
-          <w:sz w:val="20"/>
-          <w:szCs w:val="20"/>
+        <w:pStyle w:val="NoSpacing"/>
+        <w:ind w:left="720"/>
+        <w:rPr>
+          <w:color w:val="BF8F00" w:themeColor="accent4" w:themeShade="BF"/>
+        </w:rPr>
+      </w:pPr>
+      <w:r>
+        <w:rPr>
+          <w:color w:val="BF8F00" w:themeColor="accent4" w:themeShade="BF"/>
         </w:rPr>
         <w:t xml:space="preserve">    </w:t>
       </w:r>
       <w:proofErr w:type="gramStart"/>
       <w:r>
         <w:rPr>
-          <w:sz w:val="20"/>
-          <w:szCs w:val="20"/>
+          <w:color w:val="BF8F00" w:themeColor="accent4" w:themeShade="BF"/>
         </w:rPr>
         <w:t>.</w:t>
       </w:r>
       <w:proofErr w:type="spellStart"/>
       <w:r>
         <w:rPr>
-          <w:sz w:val="20"/>
-          <w:szCs w:val="20"/>
+          <w:color w:val="BF8F00" w:themeColor="accent4" w:themeShade="BF"/>
         </w:rPr>
         <w:t>maximumSize</w:t>
       </w:r>
@@ -18301,39 +18298,36 @@
       <w:proofErr w:type="gramEnd"/>
       <w:r>
         <w:rPr>
-          <w:sz w:val="20"/>
-          <w:szCs w:val="20"/>
+          <w:color w:val="BF8F00" w:themeColor="accent4" w:themeShade="BF"/>
         </w:rPr>
         <w:t>(10_000)</w:t>
       </w:r>
     </w:p>
     <w:p>
       <w:pPr>
-        <w:rPr>
-          <w:sz w:val="20"/>
-          <w:szCs w:val="20"/>
-        </w:rPr>
-      </w:pPr>
-      <w:r>
-        <w:rPr>
-          <w:sz w:val="20"/>
-          <w:szCs w:val="20"/>
+        <w:pStyle w:val="NoSpacing"/>
+        <w:ind w:left="720"/>
+        <w:rPr>
+          <w:color w:val="BF8F00" w:themeColor="accent4" w:themeShade="BF"/>
+        </w:rPr>
+      </w:pPr>
+      <w:r>
+        <w:rPr>
+          <w:color w:val="BF8F00" w:themeColor="accent4" w:themeShade="BF"/>
         </w:rPr>
         <w:t xml:space="preserve">    </w:t>
       </w:r>
       <w:proofErr w:type="gramStart"/>
       <w:r>
         <w:rPr>
-          <w:sz w:val="20"/>
-          <w:szCs w:val="20"/>
+          <w:color w:val="BF8F00" w:themeColor="accent4" w:themeShade="BF"/>
         </w:rPr>
         <w:t>.</w:t>
       </w:r>
       <w:proofErr w:type="spellStart"/>
       <w:r>
         <w:rPr>
-          <w:sz w:val="20"/>
-          <w:szCs w:val="20"/>
+          <w:color w:val="BF8F00" w:themeColor="accent4" w:themeShade="BF"/>
         </w:rPr>
         <w:t>expireAfterWrite</w:t>
       </w:r>
@@ -18341,63 +18335,57 @@
       <w:proofErr w:type="gramEnd"/>
       <w:r>
         <w:rPr>
-          <w:sz w:val="20"/>
-          <w:szCs w:val="20"/>
+          <w:color w:val="BF8F00" w:themeColor="accent4" w:themeShade="BF"/>
         </w:rPr>
         <w:t xml:space="preserve">(30, </w:t>
       </w:r>
       <w:proofErr w:type="spellStart"/>
       <w:r>
         <w:rPr>
-          <w:sz w:val="20"/>
-          <w:szCs w:val="20"/>
+          <w:color w:val="BF8F00" w:themeColor="accent4" w:themeShade="BF"/>
         </w:rPr>
         <w:t>TimeUnit.MINUTES</w:t>
       </w:r>
       <w:proofErr w:type="spellEnd"/>
       <w:r>
         <w:rPr>
-          <w:sz w:val="20"/>
-          <w:szCs w:val="20"/>
+          <w:color w:val="BF8F00" w:themeColor="accent4" w:themeShade="BF"/>
         </w:rPr>
         <w:t>)</w:t>
       </w:r>
     </w:p>
     <w:p>
       <w:pPr>
-        <w:rPr>
-          <w:sz w:val="20"/>
-          <w:szCs w:val="20"/>
-        </w:rPr>
-      </w:pPr>
-      <w:r>
-        <w:rPr>
-          <w:sz w:val="20"/>
-          <w:szCs w:val="20"/>
+        <w:pStyle w:val="NoSpacing"/>
+        <w:ind w:left="720"/>
+        <w:rPr>
+          <w:color w:val="BF8F00" w:themeColor="accent4" w:themeShade="BF"/>
+        </w:rPr>
+      </w:pPr>
+      <w:r>
+        <w:rPr>
+          <w:color w:val="BF8F00" w:themeColor="accent4" w:themeShade="BF"/>
         </w:rPr>
         <w:t xml:space="preserve">    </w:t>
       </w:r>
       <w:proofErr w:type="gramStart"/>
       <w:r>
         <w:rPr>
-          <w:sz w:val="20"/>
-          <w:szCs w:val="20"/>
+          <w:color w:val="BF8F00" w:themeColor="accent4" w:themeShade="BF"/>
         </w:rPr>
         <w:t>.build</w:t>
       </w:r>
       <w:proofErr w:type="gramEnd"/>
       <w:r>
         <w:rPr>
-          <w:sz w:val="20"/>
-          <w:szCs w:val="20"/>
+          <w:color w:val="BF8F00" w:themeColor="accent4" w:themeShade="BF"/>
         </w:rPr>
         <w:t>(</w:t>
       </w:r>
       <w:proofErr w:type="gramStart"/>
       <w:r>
         <w:rPr>
-          <w:sz w:val="20"/>
-          <w:szCs w:val="20"/>
+          <w:color w:val="BF8F00" w:themeColor="accent4" w:themeShade="BF"/>
         </w:rPr>
         <w:t>);</w:t>
       </w:r>
@@ -18488,8 +18476,14 @@
       <w:pPr>
         <w:pStyle w:val="NoSpacing"/>
         <w:ind w:left="720"/>
-      </w:pPr>
-      <w:r>
+        <w:rPr>
+          <w:color w:val="BF8F00" w:themeColor="accent4" w:themeShade="BF"/>
+        </w:rPr>
+      </w:pPr>
+      <w:r>
+        <w:rPr>
+          <w:color w:val="BF8F00" w:themeColor="accent4" w:themeShade="BF"/>
+        </w:rPr>
         <w:t>try {</w:t>
       </w:r>
     </w:p>
@@ -18497,30 +18491,51 @@
       <w:pPr>
         <w:pStyle w:val="NoSpacing"/>
         <w:ind w:left="720"/>
-      </w:pPr>
-      <w:r>
+        <w:rPr>
+          <w:color w:val="BF8F00" w:themeColor="accent4" w:themeShade="BF"/>
+        </w:rPr>
+      </w:pPr>
+      <w:r>
+        <w:rPr>
+          <w:color w:val="BF8F00" w:themeColor="accent4" w:themeShade="BF"/>
+        </w:rPr>
         <w:t xml:space="preserve">    </w:t>
       </w:r>
       <w:proofErr w:type="spellStart"/>
       <w:proofErr w:type="gramStart"/>
       <w:r>
+        <w:rPr>
+          <w:color w:val="BF8F00" w:themeColor="accent4" w:themeShade="BF"/>
+        </w:rPr>
         <w:t>cache.put</w:t>
       </w:r>
       <w:proofErr w:type="spellEnd"/>
       <w:r>
+        <w:rPr>
+          <w:color w:val="BF8F00" w:themeColor="accent4" w:themeShade="BF"/>
+        </w:rPr>
         <w:t>(</w:t>
       </w:r>
       <w:proofErr w:type="spellStart"/>
       <w:proofErr w:type="gramEnd"/>
       <w:r>
+        <w:rPr>
+          <w:color w:val="BF8F00" w:themeColor="accent4" w:themeShade="BF"/>
+        </w:rPr>
         <w:t>txId</w:t>
       </w:r>
       <w:proofErr w:type="spellEnd"/>
       <w:r>
+        <w:rPr>
+          <w:color w:val="BF8F00" w:themeColor="accent4" w:themeShade="BF"/>
+        </w:rPr>
         <w:t>, request</w:t>
       </w:r>
       <w:proofErr w:type="gramStart"/>
       <w:r>
+        <w:rPr>
+          <w:color w:val="BF8F00" w:themeColor="accent4" w:themeShade="BF"/>
+        </w:rPr>
         <w:t>);</w:t>
       </w:r>
       <w:proofErr w:type="gramEnd"/>
@@ -18529,12 +18544,21 @@
       <w:pPr>
         <w:pStyle w:val="NoSpacing"/>
         <w:ind w:left="720"/>
-      </w:pPr>
-      <w:r>
+        <w:rPr>
+          <w:color w:val="BF8F00" w:themeColor="accent4" w:themeShade="BF"/>
+        </w:rPr>
+      </w:pPr>
+      <w:r>
+        <w:rPr>
+          <w:color w:val="BF8F00" w:themeColor="accent4" w:themeShade="BF"/>
+        </w:rPr>
         <w:t xml:space="preserve">    process(request</w:t>
       </w:r>
       <w:proofErr w:type="gramStart"/>
       <w:r>
+        <w:rPr>
+          <w:color w:val="BF8F00" w:themeColor="accent4" w:themeShade="BF"/>
+        </w:rPr>
         <w:t>);</w:t>
       </w:r>
       <w:proofErr w:type="gramEnd"/>
@@ -18543,8 +18567,14 @@
       <w:pPr>
         <w:pStyle w:val="NoSpacing"/>
         <w:ind w:left="720"/>
-      </w:pPr>
-      <w:r>
+        <w:rPr>
+          <w:color w:val="BF8F00" w:themeColor="accent4" w:themeShade="BF"/>
+        </w:rPr>
+      </w:pPr>
+      <w:r>
+        <w:rPr>
+          <w:color w:val="BF8F00" w:themeColor="accent4" w:themeShade="BF"/>
+        </w:rPr>
         <w:t>} finally {</w:t>
       </w:r>
     </w:p>
@@ -18552,26 +18582,44 @@
       <w:pPr>
         <w:pStyle w:val="NoSpacing"/>
         <w:ind w:left="720"/>
-      </w:pPr>
-      <w:r>
+        <w:rPr>
+          <w:color w:val="BF8F00" w:themeColor="accent4" w:themeShade="BF"/>
+        </w:rPr>
+      </w:pPr>
+      <w:r>
+        <w:rPr>
+          <w:color w:val="BF8F00" w:themeColor="accent4" w:themeShade="BF"/>
+        </w:rPr>
         <w:t xml:space="preserve">    </w:t>
       </w:r>
       <w:proofErr w:type="spellStart"/>
       <w:proofErr w:type="gramStart"/>
       <w:r>
+        <w:rPr>
+          <w:color w:val="BF8F00" w:themeColor="accent4" w:themeShade="BF"/>
+        </w:rPr>
         <w:t>cache.remove</w:t>
       </w:r>
       <w:proofErr w:type="spellEnd"/>
       <w:proofErr w:type="gramEnd"/>
       <w:r>
+        <w:rPr>
+          <w:color w:val="BF8F00" w:themeColor="accent4" w:themeShade="BF"/>
+        </w:rPr>
         <w:t>(</w:t>
       </w:r>
       <w:proofErr w:type="spellStart"/>
       <w:r>
+        <w:rPr>
+          <w:color w:val="BF8F00" w:themeColor="accent4" w:themeShade="BF"/>
+        </w:rPr>
         <w:t>txId</w:t>
       </w:r>
       <w:proofErr w:type="spellEnd"/>
       <w:r>
+        <w:rPr>
+          <w:color w:val="BF8F00" w:themeColor="accent4" w:themeShade="BF"/>
+        </w:rPr>
         <w:t>); // Ensure the "Root" is disconnected</w:t>
       </w:r>
     </w:p>
@@ -18579,8 +18627,14 @@
       <w:pPr>
         <w:pStyle w:val="NoSpacing"/>
         <w:ind w:left="720"/>
-      </w:pPr>
-      <w:r>
+        <w:rPr>
+          <w:color w:val="BF8F00" w:themeColor="accent4" w:themeShade="BF"/>
+        </w:rPr>
+      </w:pPr>
+      <w:r>
+        <w:rPr>
+          <w:color w:val="BF8F00" w:themeColor="accent4" w:themeShade="BF"/>
+        </w:rPr>
         <w:t>}</w:t>
       </w:r>
     </w:p>
@@ -19082,14 +19136,6 @@
           <w:szCs w:val="20"/>
         </w:rPr>
       </w:pPr>
-    </w:p>
-    <w:p>
-      <w:pPr>
-        <w:rPr>
-          <w:sz w:val="20"/>
-          <w:szCs w:val="20"/>
-        </w:rPr>
-      </w:pPr>
       <w:r>
         <w:rPr>
           <w:sz w:val="20"/>
@@ -19188,16 +19234,25 @@
     <w:p>
       <w:pPr>
         <w:rPr>
-          <w:sz w:val="20"/>
-          <w:szCs w:val="20"/>
-        </w:rPr>
-      </w:pPr>
-      <w:r>
-        <w:rPr>
-          <w:sz w:val="20"/>
-          <w:szCs w:val="20"/>
-        </w:rPr>
-        <w:t xml:space="preserve">        // 1. Arrange: Access the private static field via Reflection</w:t>
+          <w:color w:val="D0CECE" w:themeColor="background2" w:themeShade="E6"/>
+          <w:sz w:val="20"/>
+          <w:szCs w:val="20"/>
+        </w:rPr>
+      </w:pPr>
+      <w:r>
+        <w:rPr>
+          <w:sz w:val="20"/>
+          <w:szCs w:val="20"/>
+        </w:rPr>
+        <w:t xml:space="preserve">        // 1. </w:t>
+      </w:r>
+      <w:r>
+        <w:rPr>
+          <w:color w:val="D0CECE" w:themeColor="background2" w:themeShade="E6"/>
+          <w:sz w:val="20"/>
+          <w:szCs w:val="20"/>
+        </w:rPr>
+        <w:t>Arrange: Access the private static field via Reflection</w:t>
       </w:r>
     </w:p>
     <w:p>
@@ -19390,7 +19445,15 @@
           <w:sz w:val="20"/>
           <w:szCs w:val="20"/>
         </w:rPr>
-        <w:t xml:space="preserve">        // Ensure baseline is clean</w:t>
+        <w:t xml:space="preserve">        // </w:t>
+      </w:r>
+      <w:r>
+        <w:rPr>
+          <w:color w:val="D0CECE" w:themeColor="background2" w:themeShade="E6"/>
+          <w:sz w:val="20"/>
+          <w:szCs w:val="20"/>
+        </w:rPr>
+        <w:t>Ensure baseline is clean</w:t>
       </w:r>
     </w:p>
     <w:p>
@@ -19438,24 +19501,25 @@
     <w:p>
       <w:pPr>
         <w:rPr>
-          <w:sz w:val="20"/>
-          <w:szCs w:val="20"/>
-        </w:rPr>
-      </w:pPr>
-    </w:p>
-    <w:p>
-      <w:pPr>
-        <w:rPr>
-          <w:sz w:val="20"/>
-          <w:szCs w:val="20"/>
-        </w:rPr>
-      </w:pPr>
-      <w:r>
-        <w:rPr>
-          <w:sz w:val="20"/>
-          <w:szCs w:val="20"/>
-        </w:rPr>
-        <w:t xml:space="preserve">        // 2. Act: Call the method that might leak</w:t>
+          <w:color w:val="D0CECE" w:themeColor="background2" w:themeShade="E6"/>
+          <w:sz w:val="20"/>
+          <w:szCs w:val="20"/>
+        </w:rPr>
+      </w:pPr>
+      <w:r>
+        <w:rPr>
+          <w:sz w:val="20"/>
+          <w:szCs w:val="20"/>
+        </w:rPr>
+        <w:t xml:space="preserve">        // 2. </w:t>
+      </w:r>
+      <w:r>
+        <w:rPr>
+          <w:color w:val="D0CECE" w:themeColor="background2" w:themeShade="E6"/>
+          <w:sz w:val="20"/>
+          <w:szCs w:val="20"/>
+        </w:rPr>
+        <w:t>Act: Call the method that might leak</w:t>
       </w:r>
     </w:p>
     <w:p>
@@ -19569,7 +19633,15 @@
           <w:sz w:val="20"/>
           <w:szCs w:val="20"/>
         </w:rPr>
-        <w:t xml:space="preserve">        // 3. Assert: The map should be empty after the process finishes</w:t>
+        <w:t xml:space="preserve">        // 3. </w:t>
+      </w:r>
+      <w:r>
+        <w:rPr>
+          <w:color w:val="D0CECE" w:themeColor="background2" w:themeShade="E6"/>
+          <w:sz w:val="20"/>
+          <w:szCs w:val="20"/>
+        </w:rPr>
+        <w:t>Assert: The map should be empty after the process finishes</w:t>
       </w:r>
     </w:p>
     <w:p>
@@ -20833,13 +20905,3360 @@
       </w:pPr>
     </w:p>
     <w:p>
-      <w:pPr>
-        <w:rPr>
-          <w:sz w:val="20"/>
-          <w:szCs w:val="20"/>
-          <w:lang w:val="en-US"/>
-        </w:rPr>
-      </w:pPr>
+      <w:r>
+        <w:rPr>
+          <w:b/>
+          <w:bCs/>
+          <w:color w:val="2E74B5" w:themeColor="accent1" w:themeShade="BF"/>
+        </w:rPr>
+        <w:t xml:space="preserve">Context: refactoring the infamous </w:t>
+      </w:r>
+      <w:proofErr w:type="spellStart"/>
+      <w:r>
+        <w:rPr>
+          <w:b/>
+          <w:bCs/>
+          <w:color w:val="2E74B5" w:themeColor="accent1" w:themeShade="BF"/>
+        </w:rPr>
+        <w:t>ObjectMapper</w:t>
+      </w:r>
+      <w:proofErr w:type="spellEnd"/>
+      <w:r>
+        <w:rPr>
+          <w:b/>
+          <w:bCs/>
+          <w:color w:val="2E74B5" w:themeColor="accent1" w:themeShade="BF"/>
+        </w:rPr>
+        <w:t xml:space="preserve"> </w:t>
+      </w:r>
+      <w:proofErr w:type="gramStart"/>
+      <w:r>
+        <w:rPr>
+          <w:b/>
+          <w:bCs/>
+          <w:color w:val="2E74B5" w:themeColor="accent1" w:themeShade="BF"/>
+        </w:rPr>
+        <w:t>class,:</w:t>
+      </w:r>
+      <w:proofErr w:type="gramEnd"/>
+      <w:r>
+        <w:rPr>
+          <w:b/>
+          <w:bCs/>
+          <w:color w:val="2E74B5" w:themeColor="accent1" w:themeShade="BF"/>
+        </w:rPr>
+        <w:br/>
+      </w:r>
+      <w:r>
+        <w:t xml:space="preserve">Your assessment is correct. Instantiating </w:t>
+      </w:r>
+      <w:proofErr w:type="spellStart"/>
+      <w:r>
+        <w:t>ObjectMapper</w:t>
+      </w:r>
+      <w:proofErr w:type="spellEnd"/>
+      <w:r>
+        <w:t xml:space="preserve"> inside a method is a significant </w:t>
+      </w:r>
+      <w:r>
+        <w:rPr>
+          <w:b/>
+          <w:bCs/>
+        </w:rPr>
+        <w:t>memory and performance anti-pattern</w:t>
+      </w:r>
+      <w:r>
+        <w:t xml:space="preserve"> in a high-concurrency Spring Boot application like your airline ticketing service.</w:t>
+      </w:r>
+    </w:p>
+    <w:p>
+      <w:r>
+        <w:t xml:space="preserve">Here are the specific changes I recommend </w:t>
+      </w:r>
+      <w:proofErr w:type="gramStart"/>
+      <w:r>
+        <w:t>to optimize</w:t>
+      </w:r>
+      <w:proofErr w:type="gramEnd"/>
+      <w:r>
+        <w:t xml:space="preserve"> your method for better memory handling and performance.</w:t>
+      </w:r>
+    </w:p>
+    <w:p>
+      <w:pPr>
+        <w:rPr>
+          <w:b/>
+          <w:bCs/>
+        </w:rPr>
+      </w:pPr>
+      <w:r>
+        <w:rPr>
+          <w:b/>
+          <w:bCs/>
+        </w:rPr>
+        <w:t xml:space="preserve">1. Stop Creating </w:t>
+      </w:r>
+      <w:proofErr w:type="spellStart"/>
+      <w:r>
+        <w:rPr>
+          <w:b/>
+          <w:bCs/>
+        </w:rPr>
+        <w:t>ObjectMapper</w:t>
+      </w:r>
+      <w:proofErr w:type="spellEnd"/>
+      <w:r>
+        <w:rPr>
+          <w:b/>
+          <w:bCs/>
+        </w:rPr>
+        <w:t xml:space="preserve"> Locally</w:t>
+      </w:r>
+    </w:p>
+    <w:p>
+      <w:r>
+        <w:t xml:space="preserve">The </w:t>
+      </w:r>
+      <w:proofErr w:type="spellStart"/>
+      <w:r>
+        <w:t>ObjectMapper</w:t>
+      </w:r>
+      <w:proofErr w:type="spellEnd"/>
+      <w:r>
+        <w:t xml:space="preserve"> is designed to be </w:t>
+      </w:r>
+      <w:r>
+        <w:rPr>
+          <w:b/>
+          <w:bCs/>
+        </w:rPr>
+        <w:t>thread-safe</w:t>
+      </w:r>
+      <w:r>
+        <w:t xml:space="preserve"> and should be reused. Creating it inside a method is an "overkill" because:</w:t>
+      </w:r>
+    </w:p>
+    <w:p>
+      <w:pPr>
+        <w:numPr>
+          <w:ilvl w:val="0"/>
+          <w:numId w:val="36"/>
+        </w:numPr>
+      </w:pPr>
+      <w:r>
+        <w:rPr>
+          <w:b/>
+          <w:bCs/>
+        </w:rPr>
+        <w:t>Heavy Initialization:</w:t>
+      </w:r>
+      <w:r>
+        <w:t xml:space="preserve"> It is an expensive object to create, as it scans the </w:t>
+      </w:r>
+      <w:proofErr w:type="spellStart"/>
+      <w:r>
+        <w:t>classpath</w:t>
+      </w:r>
+      <w:proofErr w:type="spellEnd"/>
+      <w:r>
+        <w:t xml:space="preserve"> and builds internal caches for serializers/</w:t>
+      </w:r>
+      <w:proofErr w:type="spellStart"/>
+      <w:r>
+        <w:t>deserializers</w:t>
+      </w:r>
+      <w:proofErr w:type="spellEnd"/>
+      <w:r>
+        <w:t xml:space="preserve"> every time.</w:t>
+      </w:r>
+    </w:p>
+    <w:p>
+      <w:pPr>
+        <w:numPr>
+          <w:ilvl w:val="0"/>
+          <w:numId w:val="36"/>
+        </w:numPr>
+      </w:pPr>
+      <w:r>
+        <w:rPr>
+          <w:b/>
+          <w:bCs/>
+        </w:rPr>
+        <w:t>GC Pressure:</w:t>
+      </w:r>
+      <w:r>
+        <w:t xml:space="preserve"> In a ticketing system handling hundreds of requests, creating thousands of short-lived </w:t>
+      </w:r>
+      <w:proofErr w:type="spellStart"/>
+      <w:r>
+        <w:t>ObjectMapper</w:t>
+      </w:r>
+      <w:proofErr w:type="spellEnd"/>
+      <w:r>
+        <w:t xml:space="preserve"> instances will trigger frequent </w:t>
+      </w:r>
+      <w:r>
+        <w:rPr>
+          <w:b/>
+          <w:bCs/>
+        </w:rPr>
+        <w:t>Garbage Collection (GC) pauses</w:t>
+      </w:r>
+      <w:r>
+        <w:t>, slowing down the entire application.</w:t>
+      </w:r>
+    </w:p>
+    <w:p>
+      <w:r>
+        <w:rPr>
+          <w:b/>
+          <w:bCs/>
+        </w:rPr>
+        <w:t>Recommendation:</w:t>
+      </w:r>
+      <w:r>
+        <w:t xml:space="preserve"> Inject a single, shared instance provided by Spring.</w:t>
+      </w:r>
+    </w:p>
+    <w:p>
+      <w:r>
+        <w:t>Java</w:t>
+      </w:r>
+    </w:p>
+    <w:p>
+      <w:r>
+        <w:t>@Autowired // Or use constructor injection (recommended)</w:t>
+      </w:r>
+    </w:p>
+    <w:p>
+      <w:r>
+        <w:t xml:space="preserve">private </w:t>
+      </w:r>
+      <w:proofErr w:type="spellStart"/>
+      <w:r>
+        <w:t>ObjectMapper</w:t>
+      </w:r>
+      <w:proofErr w:type="spellEnd"/>
+      <w:r>
+        <w:t xml:space="preserve"> </w:t>
+      </w:r>
+      <w:proofErr w:type="spellStart"/>
+      <w:proofErr w:type="gramStart"/>
+      <w:r>
+        <w:t>objectMapper</w:t>
+      </w:r>
+      <w:proofErr w:type="spellEnd"/>
+      <w:r>
+        <w:t>;</w:t>
+      </w:r>
+      <w:proofErr w:type="gramEnd"/>
+    </w:p>
+    <w:p>
+      <w:r>
+        <w:pict w14:anchorId="7881FA7D">
+          <v:rect id="_x0000_i1116" style="width:0;height:1.5pt" o:hralign="center" o:hrstd="t" o:hrnoshade="t" o:hr="t" fillcolor="gray" stroked="f"/>
+        </w:pict>
+      </w:r>
+    </w:p>
+    <w:p>
+      <w:pPr>
+        <w:rPr>
+          <w:b/>
+          <w:bCs/>
+        </w:rPr>
+      </w:pPr>
+      <w:r>
+        <w:rPr>
+          <w:b/>
+          <w:bCs/>
+        </w:rPr>
+        <w:t>2. Optimize the "Double-Mapping" Logic</w:t>
+      </w:r>
+    </w:p>
+    <w:p>
+      <w:pPr>
+        <w:pStyle w:val="NoSpacing"/>
+        <w:ind w:left="720"/>
+        <w:jc w:val="both"/>
+        <w:rPr>
+          <w:rFonts w:ascii="Bookman Old Style" w:hAnsi="Bookman Old Style"/>
+          <w:sz w:val="20"/>
+          <w:szCs w:val="20"/>
+        </w:rPr>
+      </w:pPr>
+      <w:r>
+        <w:rPr>
+          <w:rFonts w:ascii="Bookman Old Style" w:hAnsi="Bookman Old Style"/>
+          <w:sz w:val="20"/>
+          <w:szCs w:val="20"/>
+        </w:rPr>
+        <w:t xml:space="preserve">public </w:t>
+      </w:r>
+      <w:proofErr w:type="spellStart"/>
+      <w:r>
+        <w:rPr>
+          <w:rFonts w:ascii="Bookman Old Style" w:hAnsi="Bookman Old Style"/>
+          <w:sz w:val="20"/>
+          <w:szCs w:val="20"/>
+        </w:rPr>
+        <w:t>ReissueSearchQueryDTO</w:t>
+      </w:r>
+      <w:proofErr w:type="spellEnd"/>
+      <w:r>
+        <w:rPr>
+          <w:rFonts w:ascii="Bookman Old Style" w:hAnsi="Bookman Old Style"/>
+          <w:sz w:val="20"/>
+          <w:szCs w:val="20"/>
+        </w:rPr>
+        <w:t xml:space="preserve"> </w:t>
+      </w:r>
+      <w:proofErr w:type="spellStart"/>
+      <w:proofErr w:type="gramStart"/>
+      <w:r>
+        <w:rPr>
+          <w:rFonts w:ascii="Bookman Old Style" w:hAnsi="Bookman Old Style"/>
+          <w:b/>
+          <w:bCs/>
+          <w:sz w:val="20"/>
+          <w:szCs w:val="20"/>
+        </w:rPr>
+        <w:t>convertTripjackRequestToJson</w:t>
+      </w:r>
+      <w:proofErr w:type="spellEnd"/>
+      <w:r>
+        <w:rPr>
+          <w:rFonts w:ascii="Bookman Old Style" w:hAnsi="Bookman Old Style"/>
+          <w:sz w:val="20"/>
+          <w:szCs w:val="20"/>
+        </w:rPr>
+        <w:t>(</w:t>
+      </w:r>
+      <w:proofErr w:type="gramEnd"/>
+    </w:p>
+    <w:p>
+      <w:pPr>
+        <w:pStyle w:val="NoSpacing"/>
+        <w:ind w:left="720"/>
+        <w:jc w:val="both"/>
+        <w:rPr>
+          <w:rFonts w:ascii="Bookman Old Style" w:hAnsi="Bookman Old Style"/>
+          <w:sz w:val="20"/>
+          <w:szCs w:val="20"/>
+        </w:rPr>
+      </w:pPr>
+      <w:proofErr w:type="spellStart"/>
+      <w:r>
+        <w:rPr>
+          <w:rFonts w:ascii="Bookman Old Style" w:hAnsi="Bookman Old Style"/>
+          <w:sz w:val="20"/>
+          <w:szCs w:val="20"/>
+        </w:rPr>
+        <w:t>ReissueExploreFlightsRequestBaseDTO</w:t>
+      </w:r>
+      <w:proofErr w:type="spellEnd"/>
+      <w:r>
+        <w:rPr>
+          <w:rFonts w:ascii="Bookman Old Style" w:hAnsi="Bookman Old Style"/>
+          <w:sz w:val="20"/>
+          <w:szCs w:val="20"/>
+        </w:rPr>
+        <w:t xml:space="preserve"> </w:t>
+      </w:r>
+      <w:proofErr w:type="spellStart"/>
+      <w:r>
+        <w:rPr>
+          <w:rFonts w:ascii="Bookman Old Style" w:hAnsi="Bookman Old Style"/>
+          <w:sz w:val="20"/>
+          <w:szCs w:val="20"/>
+        </w:rPr>
+        <w:t>reissueExploreFlightsRequestDTO</w:t>
+      </w:r>
+      <w:proofErr w:type="spellEnd"/>
+      <w:r>
+        <w:rPr>
+          <w:rFonts w:ascii="Bookman Old Style" w:hAnsi="Bookman Old Style"/>
+          <w:sz w:val="20"/>
+          <w:szCs w:val="20"/>
+        </w:rPr>
+        <w:t>,</w:t>
+      </w:r>
+    </w:p>
+    <w:p>
+      <w:pPr>
+        <w:pStyle w:val="NoSpacing"/>
+        <w:ind w:left="720"/>
+        <w:jc w:val="both"/>
+        <w:rPr>
+          <w:rFonts w:ascii="Bookman Old Style" w:hAnsi="Bookman Old Style"/>
+          <w:sz w:val="20"/>
+          <w:szCs w:val="20"/>
+        </w:rPr>
+      </w:pPr>
+      <w:proofErr w:type="spellStart"/>
+      <w:r>
+        <w:rPr>
+          <w:rFonts w:ascii="Bookman Old Style" w:hAnsi="Bookman Old Style"/>
+          <w:sz w:val="20"/>
+          <w:szCs w:val="20"/>
+        </w:rPr>
+        <w:t>ReissueSearchQueryDTO</w:t>
+      </w:r>
+      <w:proofErr w:type="spellEnd"/>
+      <w:r>
+        <w:rPr>
+          <w:rFonts w:ascii="Bookman Old Style" w:hAnsi="Bookman Old Style"/>
+          <w:sz w:val="20"/>
+          <w:szCs w:val="20"/>
+        </w:rPr>
+        <w:t xml:space="preserve"> </w:t>
+      </w:r>
+      <w:proofErr w:type="spellStart"/>
+      <w:r>
+        <w:rPr>
+          <w:rFonts w:ascii="Bookman Old Style" w:hAnsi="Bookman Old Style"/>
+          <w:sz w:val="20"/>
+          <w:szCs w:val="20"/>
+        </w:rPr>
+        <w:t>exploreFlightsRequestDTO</w:t>
+      </w:r>
+      <w:proofErr w:type="spellEnd"/>
+      <w:r>
+        <w:rPr>
+          <w:rFonts w:ascii="Bookman Old Style" w:hAnsi="Bookman Old Style"/>
+          <w:sz w:val="20"/>
+          <w:szCs w:val="20"/>
+        </w:rPr>
+        <w:t>) {</w:t>
+      </w:r>
+    </w:p>
+    <w:p>
+      <w:pPr>
+        <w:pStyle w:val="NoSpacing"/>
+        <w:ind w:left="720"/>
+        <w:jc w:val="both"/>
+        <w:rPr>
+          <w:rFonts w:ascii="Bookman Old Style" w:hAnsi="Bookman Old Style"/>
+          <w:sz w:val="20"/>
+          <w:szCs w:val="20"/>
+        </w:rPr>
+      </w:pPr>
+    </w:p>
+    <w:p>
+      <w:pPr>
+        <w:pStyle w:val="NoSpacing"/>
+        <w:ind w:left="1440"/>
+        <w:jc w:val="both"/>
+        <w:rPr>
+          <w:rFonts w:ascii="Bookman Old Style" w:hAnsi="Bookman Old Style"/>
+          <w:sz w:val="20"/>
+          <w:szCs w:val="20"/>
+        </w:rPr>
+      </w:pPr>
+      <w:proofErr w:type="gramStart"/>
+      <w:r>
+        <w:rPr>
+          <w:rFonts w:ascii="Bookman Old Style" w:hAnsi="Bookman Old Style"/>
+          <w:sz w:val="20"/>
+          <w:szCs w:val="20"/>
+        </w:rPr>
+        <w:t>logger.info(</w:t>
+      </w:r>
+      <w:proofErr w:type="gramEnd"/>
+      <w:r>
+        <w:rPr>
+          <w:rFonts w:ascii="Bookman Old Style" w:hAnsi="Bookman Old Style"/>
+          <w:sz w:val="20"/>
+          <w:szCs w:val="20"/>
+        </w:rPr>
+        <w:t xml:space="preserve">"Explore flights mapping started for request received from </w:t>
+      </w:r>
+      <w:proofErr w:type="spellStart"/>
+      <w:r>
+        <w:rPr>
+          <w:rFonts w:ascii="Bookman Old Style" w:hAnsi="Bookman Old Style"/>
+          <w:sz w:val="20"/>
+          <w:szCs w:val="20"/>
+        </w:rPr>
+        <w:t>rezair</w:t>
+      </w:r>
+      <w:proofErr w:type="spellEnd"/>
+      <w:r>
+        <w:rPr>
+          <w:rFonts w:ascii="Bookman Old Style" w:hAnsi="Bookman Old Style"/>
+          <w:sz w:val="20"/>
+          <w:szCs w:val="20"/>
+        </w:rPr>
+        <w:t xml:space="preserve"> to </w:t>
+      </w:r>
+      <w:proofErr w:type="spellStart"/>
+      <w:r>
+        <w:rPr>
+          <w:rFonts w:ascii="Bookman Old Style" w:hAnsi="Bookman Old Style"/>
+          <w:sz w:val="20"/>
+          <w:szCs w:val="20"/>
+        </w:rPr>
+        <w:t>tripjack</w:t>
+      </w:r>
+      <w:proofErr w:type="spellEnd"/>
+      <w:r>
+        <w:rPr>
+          <w:rFonts w:ascii="Bookman Old Style" w:hAnsi="Bookman Old Style"/>
+          <w:sz w:val="20"/>
+          <w:szCs w:val="20"/>
+        </w:rPr>
+        <w:t>"</w:t>
+      </w:r>
+      <w:proofErr w:type="gramStart"/>
+      <w:r>
+        <w:rPr>
+          <w:rFonts w:ascii="Bookman Old Style" w:hAnsi="Bookman Old Style"/>
+          <w:sz w:val="20"/>
+          <w:szCs w:val="20"/>
+        </w:rPr>
+        <w:t>);</w:t>
+      </w:r>
+      <w:proofErr w:type="gramEnd"/>
+    </w:p>
+    <w:p>
+      <w:pPr>
+        <w:pStyle w:val="NoSpacing"/>
+        <w:ind w:left="1440"/>
+        <w:jc w:val="both"/>
+        <w:rPr>
+          <w:rFonts w:ascii="Bookman Old Style" w:hAnsi="Bookman Old Style"/>
+          <w:sz w:val="20"/>
+          <w:szCs w:val="20"/>
+        </w:rPr>
+      </w:pPr>
+      <w:proofErr w:type="spellStart"/>
+      <w:r>
+        <w:rPr>
+          <w:rFonts w:ascii="Bookman Old Style" w:hAnsi="Bookman Old Style"/>
+          <w:sz w:val="20"/>
+          <w:szCs w:val="20"/>
+        </w:rPr>
+        <w:t>ObjectMapper</w:t>
+      </w:r>
+      <w:proofErr w:type="spellEnd"/>
+      <w:r>
+        <w:rPr>
+          <w:rFonts w:ascii="Bookman Old Style" w:hAnsi="Bookman Old Style"/>
+          <w:sz w:val="20"/>
+          <w:szCs w:val="20"/>
+        </w:rPr>
+        <w:t xml:space="preserve"> </w:t>
+      </w:r>
+      <w:proofErr w:type="spellStart"/>
+      <w:r>
+        <w:rPr>
+          <w:rFonts w:ascii="Bookman Old Style" w:hAnsi="Bookman Old Style"/>
+          <w:sz w:val="20"/>
+          <w:szCs w:val="20"/>
+          <w:highlight w:val="magenta"/>
+        </w:rPr>
+        <w:t>objectMapper</w:t>
+      </w:r>
+      <w:proofErr w:type="spellEnd"/>
+      <w:r>
+        <w:rPr>
+          <w:rFonts w:ascii="Bookman Old Style" w:hAnsi="Bookman Old Style"/>
+          <w:sz w:val="20"/>
+          <w:szCs w:val="20"/>
+        </w:rPr>
+        <w:t xml:space="preserve"> = new </w:t>
+      </w:r>
+      <w:proofErr w:type="spellStart"/>
+      <w:proofErr w:type="gramStart"/>
+      <w:r>
+        <w:rPr>
+          <w:rFonts w:ascii="Bookman Old Style" w:hAnsi="Bookman Old Style"/>
+          <w:sz w:val="20"/>
+          <w:szCs w:val="20"/>
+        </w:rPr>
+        <w:t>ObjectMapper</w:t>
+      </w:r>
+      <w:proofErr w:type="spellEnd"/>
+      <w:r>
+        <w:rPr>
+          <w:rFonts w:ascii="Bookman Old Style" w:hAnsi="Bookman Old Style"/>
+          <w:sz w:val="20"/>
+          <w:szCs w:val="20"/>
+        </w:rPr>
+        <w:t>();</w:t>
+      </w:r>
+      <w:proofErr w:type="gramEnd"/>
+    </w:p>
+    <w:p>
+      <w:pPr>
+        <w:pStyle w:val="NoSpacing"/>
+        <w:ind w:left="1440"/>
+        <w:jc w:val="both"/>
+        <w:rPr>
+          <w:rFonts w:ascii="Bookman Old Style" w:hAnsi="Bookman Old Style"/>
+          <w:sz w:val="20"/>
+          <w:szCs w:val="20"/>
+        </w:rPr>
+      </w:pPr>
+    </w:p>
+    <w:p>
+      <w:pPr>
+        <w:pStyle w:val="NoSpacing"/>
+        <w:ind w:left="1440"/>
+        <w:jc w:val="both"/>
+        <w:rPr>
+          <w:rFonts w:ascii="Bookman Old Style" w:hAnsi="Bookman Old Style"/>
+          <w:sz w:val="20"/>
+          <w:szCs w:val="20"/>
+        </w:rPr>
+      </w:pPr>
+      <w:r>
+        <w:rPr>
+          <w:rFonts w:ascii="Bookman Old Style" w:hAnsi="Bookman Old Style"/>
+          <w:sz w:val="20"/>
+          <w:szCs w:val="20"/>
+        </w:rPr>
+        <w:t xml:space="preserve">String </w:t>
+      </w:r>
+      <w:proofErr w:type="spellStart"/>
+      <w:proofErr w:type="gramStart"/>
+      <w:r>
+        <w:rPr>
+          <w:rFonts w:ascii="Bookman Old Style" w:hAnsi="Bookman Old Style"/>
+          <w:sz w:val="20"/>
+          <w:szCs w:val="20"/>
+        </w:rPr>
+        <w:t>exploreFlightsRequestJson</w:t>
+      </w:r>
+      <w:proofErr w:type="spellEnd"/>
+      <w:r>
+        <w:rPr>
+          <w:rFonts w:ascii="Bookman Old Style" w:hAnsi="Bookman Old Style"/>
+          <w:sz w:val="20"/>
+          <w:szCs w:val="20"/>
+        </w:rPr>
+        <w:t>;</w:t>
+      </w:r>
+      <w:proofErr w:type="gramEnd"/>
+    </w:p>
+    <w:p>
+      <w:pPr>
+        <w:pStyle w:val="NoSpacing"/>
+        <w:ind w:left="720"/>
+        <w:jc w:val="both"/>
+        <w:rPr>
+          <w:rFonts w:ascii="Bookman Old Style" w:hAnsi="Bookman Old Style"/>
+          <w:sz w:val="20"/>
+          <w:szCs w:val="20"/>
+        </w:rPr>
+      </w:pPr>
+      <w:r>
+        <w:rPr>
+          <w:rFonts w:ascii="Bookman Old Style" w:hAnsi="Bookman Old Style"/>
+          <w:sz w:val="20"/>
+          <w:szCs w:val="20"/>
+        </w:rPr>
+        <w:t>try {</w:t>
+      </w:r>
+    </w:p>
+    <w:p>
+      <w:pPr>
+        <w:pStyle w:val="NoSpacing"/>
+        <w:ind w:left="720"/>
+        <w:jc w:val="both"/>
+        <w:rPr>
+          <w:rFonts w:ascii="Bookman Old Style" w:hAnsi="Bookman Old Style"/>
+          <w:color w:val="767171" w:themeColor="background2" w:themeShade="80"/>
+          <w:sz w:val="20"/>
+          <w:szCs w:val="20"/>
+        </w:rPr>
+      </w:pPr>
+      <w:r>
+        <w:rPr>
+          <w:rFonts w:ascii="Bookman Old Style" w:hAnsi="Bookman Old Style"/>
+          <w:color w:val="767171" w:themeColor="background2" w:themeShade="80"/>
+          <w:sz w:val="20"/>
+          <w:szCs w:val="20"/>
+          <w:highlight w:val="yellow"/>
+        </w:rPr>
+        <w:t xml:space="preserve">// convert base request to </w:t>
+      </w:r>
+      <w:proofErr w:type="spellStart"/>
+      <w:r>
+        <w:rPr>
+          <w:rFonts w:ascii="Bookman Old Style" w:hAnsi="Bookman Old Style"/>
+          <w:color w:val="767171" w:themeColor="background2" w:themeShade="80"/>
+          <w:sz w:val="20"/>
+          <w:szCs w:val="20"/>
+          <w:highlight w:val="yellow"/>
+        </w:rPr>
+        <w:t>json</w:t>
+      </w:r>
+      <w:proofErr w:type="spellEnd"/>
+    </w:p>
+    <w:p>
+      <w:pPr>
+        <w:pStyle w:val="NoSpacing"/>
+        <w:ind w:left="1440"/>
+        <w:jc w:val="both"/>
+        <w:rPr>
+          <w:rFonts w:ascii="Bookman Old Style" w:hAnsi="Bookman Old Style"/>
+          <w:sz w:val="20"/>
+          <w:szCs w:val="20"/>
+        </w:rPr>
+      </w:pPr>
+      <w:proofErr w:type="spellStart"/>
+      <w:r>
+        <w:rPr>
+          <w:rFonts w:ascii="Bookman Old Style" w:hAnsi="Bookman Old Style"/>
+          <w:sz w:val="20"/>
+          <w:szCs w:val="20"/>
+        </w:rPr>
+        <w:t>exploreFlightsRequestJson</w:t>
+      </w:r>
+      <w:proofErr w:type="spellEnd"/>
+      <w:r>
+        <w:rPr>
+          <w:rFonts w:ascii="Bookman Old Style" w:hAnsi="Bookman Old Style"/>
+          <w:sz w:val="20"/>
+          <w:szCs w:val="20"/>
+        </w:rPr>
+        <w:t xml:space="preserve"> = </w:t>
+      </w:r>
+      <w:r>
+        <w:rPr>
+          <w:rFonts w:ascii="Bookman Old Style" w:hAnsi="Bookman Old Style"/>
+          <w:sz w:val="20"/>
+          <w:szCs w:val="20"/>
+          <w:highlight w:val="magenta"/>
+        </w:rPr>
+        <w:t>objectMapper</w:t>
+      </w:r>
+      <w:r>
+        <w:rPr>
+          <w:rFonts w:ascii="Bookman Old Style" w:hAnsi="Bookman Old Style"/>
+          <w:sz w:val="20"/>
+          <w:szCs w:val="20"/>
+        </w:rPr>
+        <w:t>.writeValueAsString(reissueExploreFlightsRequestDTO</w:t>
+      </w:r>
+      <w:proofErr w:type="gramStart"/>
+      <w:r>
+        <w:rPr>
+          <w:rFonts w:ascii="Bookman Old Style" w:hAnsi="Bookman Old Style"/>
+          <w:sz w:val="20"/>
+          <w:szCs w:val="20"/>
+        </w:rPr>
+        <w:t>);</w:t>
+      </w:r>
+      <w:proofErr w:type="gramEnd"/>
+    </w:p>
+    <w:p>
+      <w:pPr>
+        <w:pStyle w:val="NoSpacing"/>
+        <w:ind w:left="1440"/>
+        <w:jc w:val="both"/>
+        <w:rPr>
+          <w:rFonts w:ascii="Bookman Old Style" w:hAnsi="Bookman Old Style"/>
+          <w:sz w:val="20"/>
+          <w:szCs w:val="20"/>
+        </w:rPr>
+      </w:pPr>
+      <w:proofErr w:type="spellStart"/>
+      <w:r>
+        <w:rPr>
+          <w:rFonts w:ascii="Bookman Old Style" w:hAnsi="Bookman Old Style"/>
+          <w:sz w:val="20"/>
+          <w:szCs w:val="20"/>
+        </w:rPr>
+        <w:t>JsonNode</w:t>
+      </w:r>
+      <w:proofErr w:type="spellEnd"/>
+      <w:r>
+        <w:rPr>
+          <w:rFonts w:ascii="Bookman Old Style" w:hAnsi="Bookman Old Style"/>
+          <w:sz w:val="20"/>
+          <w:szCs w:val="20"/>
+        </w:rPr>
+        <w:t xml:space="preserve"> root = </w:t>
+      </w:r>
+      <w:proofErr w:type="spellStart"/>
+      <w:r>
+        <w:rPr>
+          <w:rFonts w:ascii="Bookman Old Style" w:hAnsi="Bookman Old Style"/>
+          <w:sz w:val="20"/>
+          <w:szCs w:val="20"/>
+          <w:highlight w:val="magenta"/>
+        </w:rPr>
+        <w:t>objectMapper</w:t>
+      </w:r>
+      <w:r>
+        <w:rPr>
+          <w:rFonts w:ascii="Bookman Old Style" w:hAnsi="Bookman Old Style"/>
+          <w:sz w:val="20"/>
+          <w:szCs w:val="20"/>
+        </w:rPr>
+        <w:t>.readTree</w:t>
+      </w:r>
+      <w:proofErr w:type="spellEnd"/>
+      <w:r>
+        <w:rPr>
+          <w:rFonts w:ascii="Bookman Old Style" w:hAnsi="Bookman Old Style"/>
+          <w:sz w:val="20"/>
+          <w:szCs w:val="20"/>
+        </w:rPr>
+        <w:t>(</w:t>
+      </w:r>
+      <w:proofErr w:type="spellStart"/>
+      <w:r>
+        <w:rPr>
+          <w:rFonts w:ascii="Bookman Old Style" w:hAnsi="Bookman Old Style"/>
+          <w:sz w:val="20"/>
+          <w:szCs w:val="20"/>
+        </w:rPr>
+        <w:t>exploreFlightsRequestJson</w:t>
+      </w:r>
+      <w:proofErr w:type="spellEnd"/>
+      <w:proofErr w:type="gramStart"/>
+      <w:r>
+        <w:rPr>
+          <w:rFonts w:ascii="Bookman Old Style" w:hAnsi="Bookman Old Style"/>
+          <w:sz w:val="20"/>
+          <w:szCs w:val="20"/>
+        </w:rPr>
+        <w:t>);</w:t>
+      </w:r>
+      <w:proofErr w:type="gramEnd"/>
+    </w:p>
+    <w:p>
+      <w:pPr>
+        <w:pStyle w:val="NoSpacing"/>
+        <w:ind w:left="1440"/>
+        <w:jc w:val="both"/>
+        <w:rPr>
+          <w:rFonts w:ascii="Bookman Old Style" w:hAnsi="Bookman Old Style"/>
+          <w:sz w:val="20"/>
+          <w:szCs w:val="20"/>
+        </w:rPr>
+      </w:pPr>
+    </w:p>
+    <w:p>
+      <w:pPr>
+        <w:pStyle w:val="NoSpacing"/>
+        <w:ind w:left="1440"/>
+        <w:jc w:val="both"/>
+        <w:rPr>
+          <w:rFonts w:ascii="Bookman Old Style" w:hAnsi="Bookman Old Style"/>
+          <w:sz w:val="20"/>
+          <w:szCs w:val="20"/>
+        </w:rPr>
+      </w:pPr>
+      <w:proofErr w:type="spellStart"/>
+      <w:r>
+        <w:rPr>
+          <w:rFonts w:ascii="Bookman Old Style" w:hAnsi="Bookman Old Style"/>
+          <w:sz w:val="20"/>
+          <w:szCs w:val="20"/>
+        </w:rPr>
+        <w:t>ReissueSearchQueryDTO</w:t>
+      </w:r>
+      <w:proofErr w:type="spellEnd"/>
+      <w:r>
+        <w:rPr>
+          <w:rFonts w:ascii="Bookman Old Style" w:hAnsi="Bookman Old Style"/>
+          <w:sz w:val="20"/>
+          <w:szCs w:val="20"/>
+        </w:rPr>
+        <w:t xml:space="preserve"> </w:t>
+      </w:r>
+      <w:proofErr w:type="spellStart"/>
+      <w:r>
+        <w:rPr>
+          <w:rFonts w:ascii="Bookman Old Style" w:hAnsi="Bookman Old Style"/>
+          <w:sz w:val="20"/>
+          <w:szCs w:val="20"/>
+        </w:rPr>
+        <w:t>searchQuery</w:t>
+      </w:r>
+      <w:proofErr w:type="spellEnd"/>
+      <w:r>
+        <w:rPr>
+          <w:rFonts w:ascii="Bookman Old Style" w:hAnsi="Bookman Old Style"/>
+          <w:sz w:val="20"/>
+          <w:szCs w:val="20"/>
+        </w:rPr>
+        <w:t xml:space="preserve"> = </w:t>
+      </w:r>
+      <w:proofErr w:type="spellStart"/>
+      <w:r>
+        <w:rPr>
+          <w:rFonts w:ascii="Bookman Old Style" w:hAnsi="Bookman Old Style"/>
+          <w:sz w:val="20"/>
+          <w:szCs w:val="20"/>
+          <w:highlight w:val="magenta"/>
+        </w:rPr>
+        <w:t>objectMapper</w:t>
+      </w:r>
+      <w:r>
+        <w:rPr>
+          <w:rFonts w:ascii="Bookman Old Style" w:hAnsi="Bookman Old Style"/>
+          <w:sz w:val="20"/>
+          <w:szCs w:val="20"/>
+        </w:rPr>
+        <w:t>.treeToValue</w:t>
+      </w:r>
+      <w:proofErr w:type="spellEnd"/>
+      <w:r>
+        <w:rPr>
+          <w:rFonts w:ascii="Bookman Old Style" w:hAnsi="Bookman Old Style"/>
+          <w:sz w:val="20"/>
+          <w:szCs w:val="20"/>
+        </w:rPr>
+        <w:t xml:space="preserve">(root, </w:t>
+      </w:r>
+      <w:proofErr w:type="spellStart"/>
+      <w:r>
+        <w:rPr>
+          <w:rFonts w:ascii="Bookman Old Style" w:hAnsi="Bookman Old Style"/>
+          <w:sz w:val="20"/>
+          <w:szCs w:val="20"/>
+        </w:rPr>
+        <w:t>ReissueSearchQueryDTO.class</w:t>
+      </w:r>
+      <w:proofErr w:type="spellEnd"/>
+      <w:proofErr w:type="gramStart"/>
+      <w:r>
+        <w:rPr>
+          <w:rFonts w:ascii="Bookman Old Style" w:hAnsi="Bookman Old Style"/>
+          <w:sz w:val="20"/>
+          <w:szCs w:val="20"/>
+        </w:rPr>
+        <w:t>);</w:t>
+      </w:r>
+      <w:proofErr w:type="gramEnd"/>
+    </w:p>
+    <w:p>
+      <w:pPr>
+        <w:pStyle w:val="NoSpacing"/>
+        <w:ind w:left="720"/>
+        <w:jc w:val="both"/>
+        <w:rPr>
+          <w:rFonts w:ascii="Bookman Old Style" w:hAnsi="Bookman Old Style"/>
+          <w:sz w:val="20"/>
+          <w:szCs w:val="20"/>
+        </w:rPr>
+      </w:pPr>
+    </w:p>
+    <w:p>
+      <w:pPr>
+        <w:pStyle w:val="NoSpacing"/>
+        <w:ind w:left="720"/>
+        <w:jc w:val="both"/>
+        <w:rPr>
+          <w:rFonts w:ascii="Bookman Old Style" w:hAnsi="Bookman Old Style"/>
+          <w:sz w:val="20"/>
+          <w:szCs w:val="20"/>
+        </w:rPr>
+      </w:pPr>
+      <w:proofErr w:type="spellStart"/>
+      <w:proofErr w:type="gramStart"/>
+      <w:r>
+        <w:rPr>
+          <w:rFonts w:ascii="Bookman Old Style" w:hAnsi="Bookman Old Style"/>
+          <w:sz w:val="20"/>
+          <w:szCs w:val="20"/>
+        </w:rPr>
+        <w:t>setPaxDetails</w:t>
+      </w:r>
+      <w:proofErr w:type="spellEnd"/>
+      <w:r>
+        <w:rPr>
+          <w:rFonts w:ascii="Bookman Old Style" w:hAnsi="Bookman Old Style"/>
+          <w:sz w:val="20"/>
+          <w:szCs w:val="20"/>
+        </w:rPr>
+        <w:t>(</w:t>
+      </w:r>
+      <w:proofErr w:type="spellStart"/>
+      <w:proofErr w:type="gramEnd"/>
+      <w:r>
+        <w:rPr>
+          <w:rFonts w:ascii="Bookman Old Style" w:hAnsi="Bookman Old Style"/>
+          <w:sz w:val="20"/>
+          <w:szCs w:val="20"/>
+        </w:rPr>
+        <w:t>reissueExploreFlightsRequestDTO</w:t>
+      </w:r>
+      <w:proofErr w:type="spellEnd"/>
+      <w:r>
+        <w:rPr>
+          <w:rFonts w:ascii="Bookman Old Style" w:hAnsi="Bookman Old Style"/>
+          <w:sz w:val="20"/>
+          <w:szCs w:val="20"/>
+        </w:rPr>
+        <w:t xml:space="preserve">, </w:t>
+      </w:r>
+      <w:proofErr w:type="spellStart"/>
+      <w:r>
+        <w:rPr>
+          <w:rFonts w:ascii="Bookman Old Style" w:hAnsi="Bookman Old Style"/>
+          <w:sz w:val="20"/>
+          <w:szCs w:val="20"/>
+        </w:rPr>
+        <w:t>searchQuery</w:t>
+      </w:r>
+      <w:proofErr w:type="spellEnd"/>
+      <w:proofErr w:type="gramStart"/>
+      <w:r>
+        <w:rPr>
+          <w:rFonts w:ascii="Bookman Old Style" w:hAnsi="Bookman Old Style"/>
+          <w:sz w:val="20"/>
+          <w:szCs w:val="20"/>
+        </w:rPr>
+        <w:t>);</w:t>
+      </w:r>
+      <w:proofErr w:type="gramEnd"/>
+    </w:p>
+    <w:p>
+      <w:pPr>
+        <w:pStyle w:val="NoSpacing"/>
+        <w:ind w:left="720"/>
+        <w:jc w:val="both"/>
+        <w:rPr>
+          <w:rFonts w:ascii="Bookman Old Style" w:hAnsi="Bookman Old Style"/>
+          <w:sz w:val="20"/>
+          <w:szCs w:val="20"/>
+        </w:rPr>
+      </w:pPr>
+    </w:p>
+    <w:p>
+      <w:pPr>
+        <w:pStyle w:val="NoSpacing"/>
+        <w:ind w:left="1440"/>
+        <w:jc w:val="both"/>
+        <w:rPr>
+          <w:rFonts w:ascii="Bookman Old Style" w:hAnsi="Bookman Old Style"/>
+          <w:sz w:val="20"/>
+          <w:szCs w:val="20"/>
+        </w:rPr>
+      </w:pPr>
+      <w:r>
+        <w:rPr>
+          <w:rFonts w:ascii="Bookman Old Style" w:hAnsi="Bookman Old Style"/>
+          <w:sz w:val="20"/>
+          <w:szCs w:val="20"/>
+        </w:rPr>
+        <w:t xml:space="preserve">// </w:t>
+      </w:r>
+      <w:r>
+        <w:rPr>
+          <w:rFonts w:ascii="Bookman Old Style" w:hAnsi="Bookman Old Style"/>
+          <w:b/>
+          <w:bCs/>
+          <w:color w:val="767171" w:themeColor="background2" w:themeShade="80"/>
+          <w:sz w:val="20"/>
+          <w:szCs w:val="20"/>
+        </w:rPr>
+        <w:t>set route information</w:t>
+      </w:r>
+    </w:p>
+    <w:p>
+      <w:pPr>
+        <w:pStyle w:val="NoSpacing"/>
+        <w:ind w:left="1440"/>
+        <w:jc w:val="both"/>
+        <w:rPr>
+          <w:rFonts w:ascii="Bookman Old Style" w:hAnsi="Bookman Old Style"/>
+          <w:sz w:val="20"/>
+          <w:szCs w:val="20"/>
+        </w:rPr>
+      </w:pPr>
+      <w:proofErr w:type="spellStart"/>
+      <w:proofErr w:type="gramStart"/>
+      <w:r>
+        <w:rPr>
+          <w:rFonts w:ascii="Bookman Old Style" w:hAnsi="Bookman Old Style"/>
+          <w:sz w:val="20"/>
+          <w:szCs w:val="20"/>
+        </w:rPr>
+        <w:t>setRouteInfos</w:t>
+      </w:r>
+      <w:proofErr w:type="spellEnd"/>
+      <w:r>
+        <w:rPr>
+          <w:rFonts w:ascii="Bookman Old Style" w:hAnsi="Bookman Old Style"/>
+          <w:sz w:val="20"/>
+          <w:szCs w:val="20"/>
+        </w:rPr>
+        <w:t>(</w:t>
+      </w:r>
+      <w:proofErr w:type="spellStart"/>
+      <w:proofErr w:type="gramEnd"/>
+      <w:r>
+        <w:rPr>
+          <w:rFonts w:ascii="Bookman Old Style" w:hAnsi="Bookman Old Style"/>
+          <w:sz w:val="20"/>
+          <w:szCs w:val="20"/>
+        </w:rPr>
+        <w:t>reissueExploreFlightsRequestDTO</w:t>
+      </w:r>
+      <w:proofErr w:type="spellEnd"/>
+      <w:r>
+        <w:rPr>
+          <w:rFonts w:ascii="Bookman Old Style" w:hAnsi="Bookman Old Style"/>
+          <w:sz w:val="20"/>
+          <w:szCs w:val="20"/>
+        </w:rPr>
+        <w:t xml:space="preserve">, </w:t>
+      </w:r>
+      <w:proofErr w:type="spellStart"/>
+      <w:r>
+        <w:rPr>
+          <w:rFonts w:ascii="Bookman Old Style" w:hAnsi="Bookman Old Style"/>
+          <w:sz w:val="20"/>
+          <w:szCs w:val="20"/>
+        </w:rPr>
+        <w:t>searchQuery</w:t>
+      </w:r>
+      <w:proofErr w:type="spellEnd"/>
+      <w:proofErr w:type="gramStart"/>
+      <w:r>
+        <w:rPr>
+          <w:rFonts w:ascii="Bookman Old Style" w:hAnsi="Bookman Old Style"/>
+          <w:sz w:val="20"/>
+          <w:szCs w:val="20"/>
+        </w:rPr>
+        <w:t>);</w:t>
+      </w:r>
+      <w:proofErr w:type="gramEnd"/>
+    </w:p>
+    <w:p>
+      <w:pPr>
+        <w:pStyle w:val="NoSpacing"/>
+        <w:ind w:left="1440"/>
+        <w:jc w:val="both"/>
+        <w:rPr>
+          <w:rFonts w:ascii="Bookman Old Style" w:hAnsi="Bookman Old Style"/>
+          <w:sz w:val="20"/>
+          <w:szCs w:val="20"/>
+        </w:rPr>
+      </w:pPr>
+      <w:r>
+        <w:rPr>
+          <w:rFonts w:ascii="Bookman Old Style" w:hAnsi="Bookman Old Style"/>
+          <w:sz w:val="20"/>
+          <w:szCs w:val="20"/>
+        </w:rPr>
+        <w:t>searchQuery.setPaxIds(reissueExploreFlightsRequestDTO.getPaxIds()</w:t>
+      </w:r>
+      <w:proofErr w:type="gramStart"/>
+      <w:r>
+        <w:rPr>
+          <w:rFonts w:ascii="Bookman Old Style" w:hAnsi="Bookman Old Style"/>
+          <w:sz w:val="20"/>
+          <w:szCs w:val="20"/>
+        </w:rPr>
+        <w:t>);</w:t>
+      </w:r>
+      <w:proofErr w:type="gramEnd"/>
+    </w:p>
+    <w:p>
+      <w:pPr>
+        <w:pStyle w:val="NoSpacing"/>
+        <w:ind w:left="1440"/>
+        <w:jc w:val="both"/>
+        <w:rPr>
+          <w:rFonts w:ascii="Bookman Old Style" w:hAnsi="Bookman Old Style"/>
+          <w:sz w:val="20"/>
+          <w:szCs w:val="20"/>
+        </w:rPr>
+      </w:pPr>
+      <w:r>
+        <w:rPr>
+          <w:rFonts w:ascii="Bookman Old Style" w:hAnsi="Bookman Old Style"/>
+          <w:sz w:val="20"/>
+          <w:szCs w:val="20"/>
+        </w:rPr>
+        <w:t>searchQuery.setOldBookingId(reissueExploreFlightsRequestDTO.getOldBookingId()</w:t>
+      </w:r>
+      <w:proofErr w:type="gramStart"/>
+      <w:r>
+        <w:rPr>
+          <w:rFonts w:ascii="Bookman Old Style" w:hAnsi="Bookman Old Style"/>
+          <w:sz w:val="20"/>
+          <w:szCs w:val="20"/>
+        </w:rPr>
+        <w:t>);</w:t>
+      </w:r>
+      <w:proofErr w:type="gramEnd"/>
+    </w:p>
+    <w:p>
+      <w:pPr>
+        <w:pStyle w:val="NoSpacing"/>
+        <w:ind w:left="1440"/>
+        <w:jc w:val="both"/>
+        <w:rPr>
+          <w:rFonts w:ascii="Bookman Old Style" w:hAnsi="Bookman Old Style"/>
+          <w:sz w:val="20"/>
+          <w:szCs w:val="20"/>
+        </w:rPr>
+      </w:pPr>
+      <w:proofErr w:type="spellStart"/>
+      <w:r>
+        <w:rPr>
+          <w:rFonts w:ascii="Bookman Old Style" w:hAnsi="Bookman Old Style"/>
+          <w:sz w:val="20"/>
+          <w:szCs w:val="20"/>
+        </w:rPr>
+        <w:t>searchQuery.setPnr</w:t>
+      </w:r>
+      <w:proofErr w:type="spellEnd"/>
+      <w:r>
+        <w:rPr>
+          <w:rFonts w:ascii="Bookman Old Style" w:hAnsi="Bookman Old Style"/>
+          <w:sz w:val="20"/>
+          <w:szCs w:val="20"/>
+        </w:rPr>
+        <w:t>(</w:t>
+      </w:r>
+      <w:proofErr w:type="spellStart"/>
+      <w:r>
+        <w:rPr>
+          <w:rFonts w:ascii="Bookman Old Style" w:hAnsi="Bookman Old Style"/>
+          <w:sz w:val="20"/>
+          <w:szCs w:val="20"/>
+        </w:rPr>
+        <w:t>reissueExploreFlightsRequestDTO.getPnr</w:t>
+      </w:r>
+      <w:proofErr w:type="spellEnd"/>
+      <w:r>
+        <w:rPr>
+          <w:rFonts w:ascii="Bookman Old Style" w:hAnsi="Bookman Old Style"/>
+          <w:sz w:val="20"/>
+          <w:szCs w:val="20"/>
+        </w:rPr>
+        <w:t>()</w:t>
+      </w:r>
+      <w:proofErr w:type="gramStart"/>
+      <w:r>
+        <w:rPr>
+          <w:rFonts w:ascii="Bookman Old Style" w:hAnsi="Bookman Old Style"/>
+          <w:sz w:val="20"/>
+          <w:szCs w:val="20"/>
+        </w:rPr>
+        <w:t>);</w:t>
+      </w:r>
+      <w:proofErr w:type="gramEnd"/>
+    </w:p>
+    <w:p>
+      <w:pPr>
+        <w:pStyle w:val="NoSpacing"/>
+        <w:ind w:left="1440"/>
+        <w:jc w:val="both"/>
+        <w:rPr>
+          <w:rFonts w:ascii="Bookman Old Style" w:hAnsi="Bookman Old Style"/>
+          <w:sz w:val="20"/>
+          <w:szCs w:val="20"/>
+        </w:rPr>
+      </w:pPr>
+      <w:proofErr w:type="gramStart"/>
+      <w:r>
+        <w:rPr>
+          <w:rFonts w:ascii="Bookman Old Style" w:hAnsi="Bookman Old Style"/>
+          <w:sz w:val="20"/>
+          <w:szCs w:val="20"/>
+        </w:rPr>
+        <w:t>logger.info(</w:t>
+      </w:r>
+      <w:proofErr w:type="gramEnd"/>
+      <w:r>
+        <w:rPr>
+          <w:rFonts w:ascii="Bookman Old Style" w:hAnsi="Bookman Old Style"/>
+          <w:sz w:val="20"/>
+          <w:szCs w:val="20"/>
+        </w:rPr>
+        <w:t xml:space="preserve">"Explore flights mapping completed for request received from </w:t>
+      </w:r>
+      <w:proofErr w:type="spellStart"/>
+      <w:r>
+        <w:rPr>
+          <w:rFonts w:ascii="Bookman Old Style" w:hAnsi="Bookman Old Style"/>
+          <w:sz w:val="20"/>
+          <w:szCs w:val="20"/>
+        </w:rPr>
+        <w:t>rezair</w:t>
+      </w:r>
+      <w:proofErr w:type="spellEnd"/>
+      <w:r>
+        <w:rPr>
+          <w:rFonts w:ascii="Bookman Old Style" w:hAnsi="Bookman Old Style"/>
+          <w:sz w:val="20"/>
+          <w:szCs w:val="20"/>
+        </w:rPr>
+        <w:t>"</w:t>
+      </w:r>
+      <w:proofErr w:type="gramStart"/>
+      <w:r>
+        <w:rPr>
+          <w:rFonts w:ascii="Bookman Old Style" w:hAnsi="Bookman Old Style"/>
+          <w:sz w:val="20"/>
+          <w:szCs w:val="20"/>
+        </w:rPr>
+        <w:t>);</w:t>
+      </w:r>
+      <w:proofErr w:type="gramEnd"/>
+    </w:p>
+    <w:p>
+      <w:pPr>
+        <w:pStyle w:val="NoSpacing"/>
+        <w:ind w:left="720"/>
+        <w:jc w:val="both"/>
+        <w:rPr>
+          <w:rFonts w:ascii="Bookman Old Style" w:hAnsi="Bookman Old Style"/>
+          <w:sz w:val="20"/>
+          <w:szCs w:val="20"/>
+        </w:rPr>
+      </w:pPr>
+      <w:r>
+        <w:rPr>
+          <w:rFonts w:ascii="Bookman Old Style" w:hAnsi="Bookman Old Style"/>
+          <w:sz w:val="20"/>
+          <w:szCs w:val="20"/>
+        </w:rPr>
+        <w:t xml:space="preserve">return </w:t>
+      </w:r>
+      <w:proofErr w:type="spellStart"/>
+      <w:proofErr w:type="gramStart"/>
+      <w:r>
+        <w:rPr>
+          <w:rFonts w:ascii="Bookman Old Style" w:hAnsi="Bookman Old Style"/>
+          <w:sz w:val="20"/>
+          <w:szCs w:val="20"/>
+        </w:rPr>
+        <w:t>searchQuery</w:t>
+      </w:r>
+      <w:proofErr w:type="spellEnd"/>
+      <w:r>
+        <w:rPr>
+          <w:rFonts w:ascii="Bookman Old Style" w:hAnsi="Bookman Old Style"/>
+          <w:sz w:val="20"/>
+          <w:szCs w:val="20"/>
+        </w:rPr>
+        <w:t>;</w:t>
+      </w:r>
+      <w:proofErr w:type="gramEnd"/>
+    </w:p>
+    <w:p>
+      <w:pPr>
+        <w:pStyle w:val="NoSpacing"/>
+        <w:ind w:left="720"/>
+        <w:jc w:val="both"/>
+        <w:rPr>
+          <w:rFonts w:ascii="Bookman Old Style" w:hAnsi="Bookman Old Style"/>
+          <w:sz w:val="20"/>
+          <w:szCs w:val="20"/>
+        </w:rPr>
+      </w:pPr>
+      <w:r>
+        <w:rPr>
+          <w:rFonts w:ascii="Bookman Old Style" w:hAnsi="Bookman Old Style"/>
+          <w:sz w:val="20"/>
+          <w:szCs w:val="20"/>
+        </w:rPr>
+        <w:t>} catch (</w:t>
+      </w:r>
+      <w:proofErr w:type="spellStart"/>
+      <w:r>
+        <w:rPr>
+          <w:rFonts w:ascii="Bookman Old Style" w:hAnsi="Bookman Old Style"/>
+          <w:sz w:val="20"/>
+          <w:szCs w:val="20"/>
+        </w:rPr>
+        <w:t>JsonProcessingException</w:t>
+      </w:r>
+      <w:proofErr w:type="spellEnd"/>
+      <w:r>
+        <w:rPr>
+          <w:rFonts w:ascii="Bookman Old Style" w:hAnsi="Bookman Old Style"/>
+          <w:sz w:val="20"/>
+          <w:szCs w:val="20"/>
+        </w:rPr>
+        <w:t xml:space="preserve"> ex) {</w:t>
+      </w:r>
+    </w:p>
+    <w:p>
+      <w:pPr>
+        <w:pStyle w:val="NoSpacing"/>
+        <w:ind w:left="1440"/>
+        <w:jc w:val="both"/>
+        <w:rPr>
+          <w:rFonts w:ascii="Bookman Old Style" w:hAnsi="Bookman Old Style"/>
+          <w:sz w:val="20"/>
+          <w:szCs w:val="20"/>
+        </w:rPr>
+      </w:pPr>
+      <w:proofErr w:type="spellStart"/>
+      <w:proofErr w:type="gramStart"/>
+      <w:r>
+        <w:rPr>
+          <w:rFonts w:ascii="Bookman Old Style" w:hAnsi="Bookman Old Style"/>
+          <w:sz w:val="20"/>
+          <w:szCs w:val="20"/>
+        </w:rPr>
+        <w:t>logger.error</w:t>
+      </w:r>
+      <w:proofErr w:type="spellEnd"/>
+      <w:proofErr w:type="gramEnd"/>
+      <w:r>
+        <w:rPr>
+          <w:rFonts w:ascii="Bookman Old Style" w:hAnsi="Bookman Old Style"/>
+          <w:sz w:val="20"/>
+          <w:szCs w:val="20"/>
+        </w:rPr>
+        <w:t>(</w:t>
+      </w:r>
+      <w:proofErr w:type="spellStart"/>
+      <w:r>
+        <w:rPr>
+          <w:rFonts w:ascii="Bookman Old Style" w:hAnsi="Bookman Old Style"/>
+          <w:sz w:val="20"/>
+          <w:szCs w:val="20"/>
+        </w:rPr>
+        <w:t>TripjackConstant.JSON_EXCEPTION_LOGGER</w:t>
+      </w:r>
+      <w:proofErr w:type="spellEnd"/>
+      <w:r>
+        <w:rPr>
+          <w:rFonts w:ascii="Bookman Old Style" w:hAnsi="Bookman Old Style"/>
+          <w:sz w:val="20"/>
+          <w:szCs w:val="20"/>
+        </w:rPr>
+        <w:t xml:space="preserve">, </w:t>
+      </w:r>
+      <w:proofErr w:type="spellStart"/>
+      <w:proofErr w:type="gramStart"/>
+      <w:r>
+        <w:rPr>
+          <w:rFonts w:ascii="Bookman Old Style" w:hAnsi="Bookman Old Style"/>
+          <w:sz w:val="20"/>
+          <w:szCs w:val="20"/>
+        </w:rPr>
+        <w:t>ex.getMessage</w:t>
+      </w:r>
+      <w:proofErr w:type="spellEnd"/>
+      <w:proofErr w:type="gramEnd"/>
+      <w:r>
+        <w:rPr>
+          <w:rFonts w:ascii="Bookman Old Style" w:hAnsi="Bookman Old Style"/>
+          <w:sz w:val="20"/>
+          <w:szCs w:val="20"/>
+        </w:rPr>
+        <w:t>()</w:t>
+      </w:r>
+      <w:proofErr w:type="gramStart"/>
+      <w:r>
+        <w:rPr>
+          <w:rFonts w:ascii="Bookman Old Style" w:hAnsi="Bookman Old Style"/>
+          <w:sz w:val="20"/>
+          <w:szCs w:val="20"/>
+        </w:rPr>
+        <w:t>);</w:t>
+      </w:r>
+      <w:proofErr w:type="gramEnd"/>
+    </w:p>
+    <w:p>
+      <w:pPr>
+        <w:pStyle w:val="NoSpacing"/>
+        <w:ind w:left="1440"/>
+        <w:jc w:val="both"/>
+        <w:rPr>
+          <w:rFonts w:ascii="Bookman Old Style" w:hAnsi="Bookman Old Style"/>
+          <w:sz w:val="20"/>
+          <w:szCs w:val="20"/>
+        </w:rPr>
+      </w:pPr>
+      <w:r>
+        <w:rPr>
+          <w:rFonts w:ascii="Bookman Old Style" w:hAnsi="Bookman Old Style"/>
+          <w:sz w:val="20"/>
+          <w:szCs w:val="20"/>
+        </w:rPr>
+        <w:t xml:space="preserve">throw new </w:t>
+      </w:r>
+      <w:proofErr w:type="spellStart"/>
+      <w:proofErr w:type="gramStart"/>
+      <w:r>
+        <w:rPr>
+          <w:rFonts w:ascii="Bookman Old Style" w:hAnsi="Bookman Old Style"/>
+          <w:sz w:val="20"/>
+          <w:szCs w:val="20"/>
+        </w:rPr>
+        <w:t>RuntimeException</w:t>
+      </w:r>
+      <w:proofErr w:type="spellEnd"/>
+      <w:r>
+        <w:rPr>
+          <w:rFonts w:ascii="Bookman Old Style" w:hAnsi="Bookman Old Style"/>
+          <w:sz w:val="20"/>
+          <w:szCs w:val="20"/>
+        </w:rPr>
+        <w:t>(</w:t>
+      </w:r>
+      <w:proofErr w:type="spellStart"/>
+      <w:proofErr w:type="gramEnd"/>
+      <w:r>
+        <w:rPr>
+          <w:rFonts w:ascii="Bookman Old Style" w:hAnsi="Bookman Old Style"/>
+          <w:sz w:val="20"/>
+          <w:szCs w:val="20"/>
+        </w:rPr>
+        <w:t>TripjackConstant.JSON_EXCEPTION_MESSAGE</w:t>
+      </w:r>
+      <w:proofErr w:type="spellEnd"/>
+      <w:r>
+        <w:rPr>
+          <w:rFonts w:ascii="Bookman Old Style" w:hAnsi="Bookman Old Style"/>
+          <w:sz w:val="20"/>
+          <w:szCs w:val="20"/>
+        </w:rPr>
+        <w:t xml:space="preserve"> + </w:t>
+      </w:r>
+      <w:proofErr w:type="spellStart"/>
+      <w:proofErr w:type="gramStart"/>
+      <w:r>
+        <w:rPr>
+          <w:rFonts w:ascii="Bookman Old Style" w:hAnsi="Bookman Old Style"/>
+          <w:sz w:val="20"/>
+          <w:szCs w:val="20"/>
+        </w:rPr>
+        <w:t>ex.getMessage</w:t>
+      </w:r>
+      <w:proofErr w:type="spellEnd"/>
+      <w:proofErr w:type="gramEnd"/>
+      <w:r>
+        <w:rPr>
+          <w:rFonts w:ascii="Bookman Old Style" w:hAnsi="Bookman Old Style"/>
+          <w:sz w:val="20"/>
+          <w:szCs w:val="20"/>
+        </w:rPr>
+        <w:t>(), ex</w:t>
+      </w:r>
+      <w:proofErr w:type="gramStart"/>
+      <w:r>
+        <w:rPr>
+          <w:rFonts w:ascii="Bookman Old Style" w:hAnsi="Bookman Old Style"/>
+          <w:sz w:val="20"/>
+          <w:szCs w:val="20"/>
+        </w:rPr>
+        <w:t>);</w:t>
+      </w:r>
+      <w:proofErr w:type="gramEnd"/>
+    </w:p>
+    <w:p>
+      <w:pPr>
+        <w:pStyle w:val="NoSpacing"/>
+        <w:ind w:left="720"/>
+        <w:jc w:val="both"/>
+        <w:rPr>
+          <w:rFonts w:ascii="Bookman Old Style" w:hAnsi="Bookman Old Style"/>
+          <w:sz w:val="20"/>
+          <w:szCs w:val="20"/>
+        </w:rPr>
+      </w:pPr>
+      <w:r>
+        <w:rPr>
+          <w:rFonts w:ascii="Bookman Old Style" w:hAnsi="Bookman Old Style"/>
+          <w:sz w:val="20"/>
+          <w:szCs w:val="20"/>
+        </w:rPr>
+        <w:t>}</w:t>
+      </w:r>
+    </w:p>
+    <w:p>
+      <w:pPr>
+        <w:pStyle w:val="NoSpacing"/>
+        <w:ind w:left="720"/>
+        <w:jc w:val="both"/>
+        <w:rPr>
+          <w:rFonts w:ascii="Bookman Old Style" w:hAnsi="Bookman Old Style"/>
+          <w:sz w:val="20"/>
+          <w:szCs w:val="20"/>
+        </w:rPr>
+      </w:pPr>
+      <w:r>
+        <w:rPr>
+          <w:rFonts w:ascii="Bookman Old Style" w:hAnsi="Bookman Old Style"/>
+          <w:sz w:val="20"/>
+          <w:szCs w:val="20"/>
+        </w:rPr>
+        <w:t>}</w:t>
+      </w:r>
+    </w:p>
+    <w:p>
+      <w:pPr>
+        <w:rPr>
+          <w:rFonts w:ascii="Bookman Old Style" w:hAnsi="Bookman Old Style"/>
+        </w:rPr>
+      </w:pPr>
+    </w:p>
+    <w:p>
+      <w:r>
+        <w:t>current code performs a "</w:t>
+      </w:r>
+      <w:r>
+        <w:rPr>
+          <w:b/>
+          <w:bCs/>
+        </w:rPr>
+        <w:t>deep copy</w:t>
+      </w:r>
+      <w:r>
+        <w:t>" using a very inefficient circular path:</w:t>
+      </w:r>
+    </w:p>
+    <w:p>
+      <w:r>
+        <w:rPr>
+          <w:noProof/>
+        </w:rPr>
+        <mc:AlternateContent>
+          <mc:Choice Requires="wps">
+            <w:drawing>
+              <wp:anchor distT="0" distB="0" distL="114300" distR="114300" simplePos="0" relativeHeight="251660288" behindDoc="0" locked="0" layoutInCell="1" allowOverlap="1" wp14:anchorId="4D83BB57" wp14:editId="51B6C448">
+                <wp:simplePos x="0" y="0"/>
+                <wp:positionH relativeFrom="column">
+                  <wp:posOffset>3556635</wp:posOffset>
+                </wp:positionH>
+                <wp:positionV relativeFrom="paragraph">
+                  <wp:posOffset>66724</wp:posOffset>
+                </wp:positionV>
+                <wp:extent cx="436098" cy="65356"/>
+                <wp:effectExtent l="0" t="19050" r="40640" b="30480"/>
+                <wp:wrapNone/>
+                <wp:docPr id="1445297977" name="Arrow: Right 1"/>
+                <wp:cNvGraphicFramePr/>
+                <a:graphic xmlns:a="http://schemas.openxmlformats.org/drawingml/2006/main">
+                  <a:graphicData uri="http://schemas.microsoft.com/office/word/2010/wordprocessingShape">
+                    <wps:wsp>
+                      <wps:cNvSpPr/>
+                      <wps:spPr>
+                        <a:xfrm>
+                          <a:off x="0" y="0"/>
+                          <a:ext cx="436098" cy="65356"/>
+                        </a:xfrm>
+                        <a:prstGeom prst="rightArrow">
+                          <a:avLst/>
+                        </a:prstGeom>
+                        <a:solidFill>
+                          <a:schemeClr val="bg2">
+                            <a:lumMod val="75000"/>
+                          </a:schemeClr>
+                        </a:solidFill>
+                      </wps:spPr>
+                      <wps:style>
+                        <a:lnRef idx="2">
+                          <a:schemeClr val="dk1">
+                            <a:shade val="15000"/>
+                          </a:schemeClr>
+                        </a:lnRef>
+                        <a:fillRef idx="1">
+                          <a:schemeClr val="dk1"/>
+                        </a:fillRef>
+                        <a:effectRef idx="0">
+                          <a:schemeClr val="dk1"/>
+                        </a:effectRef>
+                        <a:fontRef idx="minor">
+                          <a:schemeClr val="lt1"/>
+                        </a:fontRef>
+                      </wps:style>
+                      <wps:bodyPr rot="0" spcFirstLastPara="0" vertOverflow="overflow" horzOverflow="overflow" vert="horz" wrap="square" lIns="91440" tIns="45720" rIns="91440" bIns="45720" numCol="1" spcCol="0" rtlCol="0" fromWordArt="0" anchor="ctr" anchorCtr="0" forceAA="0" compatLnSpc="1">
+                        <a:prstTxWarp prst="textNoShape">
+                          <a:avLst/>
+                        </a:prstTxWarp>
+                        <a:noAutofit/>
+                      </wps:bodyPr>
+                    </wps:wsp>
+                  </a:graphicData>
+                </a:graphic>
+                <wp14:sizeRelH relativeFrom="margin">
+                  <wp14:pctWidth>0</wp14:pctWidth>
+                </wp14:sizeRelH>
+                <wp14:sizeRelV relativeFrom="margin">
+                  <wp14:pctHeight>0</wp14:pctHeight>
+                </wp14:sizeRelV>
+              </wp:anchor>
+            </w:drawing>
+          </mc:Choice>
+          <mc:Fallback>
+            <w:pict>
+              <v:shapetype w14:anchorId="578FB652" id="_x0000_t13" coordsize="21600,21600" o:spt="13" adj="16200,5400" path="m@0,l@0@1,0@1,0@2@0@2@0,21600,21600,10800xe">
+                <v:stroke joinstyle="miter"/>
+                <v:formulas>
+                  <v:f eqn="val #0"/>
+                  <v:f eqn="val #1"/>
+                  <v:f eqn="sum height 0 #1"/>
+                  <v:f eqn="sum 10800 0 #1"/>
+                  <v:f eqn="sum width 0 #0"/>
+                  <v:f eqn="prod @4 @3 10800"/>
+                  <v:f eqn="sum width 0 @5"/>
+                </v:formulas>
+                <v:path o:connecttype="custom" o:connectlocs="@0,0;0,10800;@0,21600;21600,10800" o:connectangles="270,180,90,0" textboxrect="0,@1,@6,@2"/>
+                <v:handles>
+                  <v:h position="#0,#1" xrange="0,21600" yrange="0,10800"/>
+                </v:handles>
+              </v:shapetype>
+              <v:shape id="Arrow: Right 1" o:spid="_x0000_s1026" type="#_x0000_t13" style="position:absolute;margin-left:280.05pt;margin-top:5.25pt;width:34.35pt;height:5.15pt;z-index:251660288;visibility:visible;mso-wrap-style:square;mso-width-percent:0;mso-height-percent:0;mso-wrap-distance-left:9pt;mso-wrap-distance-top:0;mso-wrap-distance-right:9pt;mso-wrap-distance-bottom:0;mso-position-horizontal:absolute;mso-position-horizontal-relative:text;mso-position-vertical:absolute;mso-position-vertical-relative:text;mso-width-percent:0;mso-height-percent:0;mso-width-relative:margin;mso-height-relative:margin;v-text-anchor:middle" o:gfxdata="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" adj="19981" fillcolor="#aeaaaa [2414]" strokecolor="black [480]" strokeweight="1pt"/>
+            </w:pict>
+          </mc:Fallback>
+        </mc:AlternateContent>
+      </w:r>
+      <w:r>
+        <w:rPr>
+          <w:noProof/>
+        </w:rPr>
+        <mc:AlternateContent>
+          <mc:Choice Requires="wps">
+            <w:drawing>
+              <wp:anchor distT="0" distB="0" distL="114300" distR="114300" simplePos="0" relativeHeight="251661312" behindDoc="0" locked="0" layoutInCell="1" allowOverlap="1" wp14:anchorId="6B94E987" wp14:editId="4ACFC50C">
+                <wp:simplePos x="0" y="0"/>
+                <wp:positionH relativeFrom="column">
+                  <wp:posOffset>2065020</wp:posOffset>
+                </wp:positionH>
+                <wp:positionV relativeFrom="paragraph">
+                  <wp:posOffset>75468</wp:posOffset>
+                </wp:positionV>
+                <wp:extent cx="436098" cy="65356"/>
+                <wp:effectExtent l="0" t="19050" r="40640" b="30480"/>
+                <wp:wrapNone/>
+                <wp:docPr id="951095859" name="Arrow: Right 1"/>
+                <wp:cNvGraphicFramePr/>
+                <a:graphic xmlns:a="http://schemas.openxmlformats.org/drawingml/2006/main">
+                  <a:graphicData uri="http://schemas.microsoft.com/office/word/2010/wordprocessingShape">
+                    <wps:wsp>
+                      <wps:cNvSpPr/>
+                      <wps:spPr>
+                        <a:xfrm>
+                          <a:off x="0" y="0"/>
+                          <a:ext cx="436098" cy="65356"/>
+                        </a:xfrm>
+                        <a:prstGeom prst="rightArrow">
+                          <a:avLst/>
+                        </a:prstGeom>
+                        <a:solidFill>
+                          <a:schemeClr val="bg2">
+                            <a:lumMod val="75000"/>
+                          </a:schemeClr>
+                        </a:solidFill>
+                      </wps:spPr>
+                      <wps:style>
+                        <a:lnRef idx="2">
+                          <a:schemeClr val="dk1">
+                            <a:shade val="15000"/>
+                          </a:schemeClr>
+                        </a:lnRef>
+                        <a:fillRef idx="1">
+                          <a:schemeClr val="dk1"/>
+                        </a:fillRef>
+                        <a:effectRef idx="0">
+                          <a:schemeClr val="dk1"/>
+                        </a:effectRef>
+                        <a:fontRef idx="minor">
+                          <a:schemeClr val="lt1"/>
+                        </a:fontRef>
+                      </wps:style>
+                      <wps:bodyPr rot="0" spcFirstLastPara="0" vertOverflow="overflow" horzOverflow="overflow" vert="horz" wrap="square" lIns="91440" tIns="45720" rIns="91440" bIns="45720" numCol="1" spcCol="0" rtlCol="0" fromWordArt="0" anchor="ctr" anchorCtr="0" forceAA="0" compatLnSpc="1">
+                        <a:prstTxWarp prst="textNoShape">
+                          <a:avLst/>
+                        </a:prstTxWarp>
+                        <a:noAutofit/>
+                      </wps:bodyPr>
+                    </wps:wsp>
+                  </a:graphicData>
+                </a:graphic>
+                <wp14:sizeRelH relativeFrom="margin">
+                  <wp14:pctWidth>0</wp14:pctWidth>
+                </wp14:sizeRelH>
+                <wp14:sizeRelV relativeFrom="margin">
+                  <wp14:pctHeight>0</wp14:pctHeight>
+                </wp14:sizeRelV>
+              </wp:anchor>
+            </w:drawing>
+          </mc:Choice>
+          <mc:Fallback>
+            <w:pict>
+              <v:shape w14:anchorId="1CDABCEC" id="Arrow: Right 1" o:spid="_x0000_s1026" type="#_x0000_t13" style="position:absolute;margin-left:162.6pt;margin-top:5.95pt;width:34.35pt;height:5.15pt;z-index:251661312;visibility:visible;mso-wrap-style:square;mso-width-percent:0;mso-height-percent:0;mso-wrap-distance-left:9pt;mso-wrap-distance-top:0;mso-wrap-distance-right:9pt;mso-wrap-distance-bottom:0;mso-position-horizontal:absolute;mso-position-horizontal-relative:text;mso-position-vertical:absolute;mso-position-vertical-relative:text;mso-width-percent:0;mso-height-percent:0;mso-width-relative:margin;mso-height-relative:margin;v-text-anchor:middle" o:gfxdata="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" adj="19981" fillcolor="#aeaaaa [2414]" strokecolor="black [480]" strokeweight="1pt"/>
+            </w:pict>
+          </mc:Fallback>
+        </mc:AlternateContent>
+      </w:r>
+      <w:r>
+        <w:rPr>
+          <w:noProof/>
+        </w:rPr>
+        <mc:AlternateContent>
+          <mc:Choice Requires="wps">
+            <w:drawing>
+              <wp:anchor distT="0" distB="0" distL="114300" distR="114300" simplePos="0" relativeHeight="251659264" behindDoc="0" locked="0" layoutInCell="1" allowOverlap="1" wp14:anchorId="1FC73182" wp14:editId="37C2FB07">
+                <wp:simplePos x="0" y="0"/>
+                <wp:positionH relativeFrom="column">
+                  <wp:posOffset>752622</wp:posOffset>
+                </wp:positionH>
+                <wp:positionV relativeFrom="paragraph">
+                  <wp:posOffset>56858</wp:posOffset>
+                </wp:positionV>
+                <wp:extent cx="436098" cy="65356"/>
+                <wp:effectExtent l="0" t="19050" r="40640" b="30480"/>
+                <wp:wrapNone/>
+                <wp:docPr id="1706702186" name="Arrow: Right 1"/>
+                <wp:cNvGraphicFramePr/>
+                <a:graphic xmlns:a="http://schemas.openxmlformats.org/drawingml/2006/main">
+                  <a:graphicData uri="http://schemas.microsoft.com/office/word/2010/wordprocessingShape">
+                    <wps:wsp>
+                      <wps:cNvSpPr/>
+                      <wps:spPr>
+                        <a:xfrm>
+                          <a:off x="0" y="0"/>
+                          <a:ext cx="436098" cy="65356"/>
+                        </a:xfrm>
+                        <a:prstGeom prst="rightArrow">
+                          <a:avLst/>
+                        </a:prstGeom>
+                        <a:solidFill>
+                          <a:schemeClr val="bg2">
+                            <a:lumMod val="75000"/>
+                          </a:schemeClr>
+                        </a:solidFill>
+                      </wps:spPr>
+                      <wps:style>
+                        <a:lnRef idx="2">
+                          <a:schemeClr val="dk1">
+                            <a:shade val="15000"/>
+                          </a:schemeClr>
+                        </a:lnRef>
+                        <a:fillRef idx="1">
+                          <a:schemeClr val="dk1"/>
+                        </a:fillRef>
+                        <a:effectRef idx="0">
+                          <a:schemeClr val="dk1"/>
+                        </a:effectRef>
+                        <a:fontRef idx="minor">
+                          <a:schemeClr val="lt1"/>
+                        </a:fontRef>
+                      </wps:style>
+                      <wps:bodyPr rot="0" spcFirstLastPara="0" vertOverflow="overflow" horzOverflow="overflow" vert="horz" wrap="square" lIns="91440" tIns="45720" rIns="91440" bIns="45720" numCol="1" spcCol="0" rtlCol="0" fromWordArt="0" anchor="ctr" anchorCtr="0" forceAA="0" compatLnSpc="1">
+                        <a:prstTxWarp prst="textNoShape">
+                          <a:avLst/>
+                        </a:prstTxWarp>
+                        <a:noAutofit/>
+                      </wps:bodyPr>
+                    </wps:wsp>
+                  </a:graphicData>
+                </a:graphic>
+                <wp14:sizeRelH relativeFrom="margin">
+                  <wp14:pctWidth>0</wp14:pctWidth>
+                </wp14:sizeRelH>
+                <wp14:sizeRelV relativeFrom="margin">
+                  <wp14:pctHeight>0</wp14:pctHeight>
+                </wp14:sizeRelV>
+              </wp:anchor>
+            </w:drawing>
+          </mc:Choice>
+          <mc:Fallback>
+            <w:pict>
+              <v:shape w14:anchorId="0A136AB6" id="Arrow: Right 1" o:spid="_x0000_s1026" type="#_x0000_t13" style="position:absolute;margin-left:59.25pt;margin-top:4.5pt;width:34.35pt;height:5.15pt;z-index:251659264;visibility:visible;mso-wrap-style:square;mso-width-percent:0;mso-height-percent:0;mso-wrap-distance-left:9pt;mso-wrap-distance-top:0;mso-wrap-distance-right:9pt;mso-wrap-distance-bottom:0;mso-position-horizontal:absolute;mso-position-horizontal-relative:text;mso-position-vertical:absolute;mso-position-vertical-relative:text;mso-width-percent:0;mso-height-percent:0;mso-width-relative:margin;mso-height-relative:margin;v-text-anchor:middle" o:gfxdata="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" adj="19981" fillcolor="#aeaaaa [2414]" strokecolor="black [480]" strokeweight="1pt"/>
+            </w:pict>
+          </mc:Fallback>
+        </mc:AlternateContent>
+      </w:r>
+      <w:r>
+        <w:t xml:space="preserve">DTO Object  </w:t>
+      </w:r>
+      <w:r>
+        <w:t xml:space="preserve">                   </w:t>
+      </w:r>
+      <w:r>
+        <w:t xml:space="preserve">JSON String </w:t>
+      </w:r>
+      <w:r>
+        <w:t xml:space="preserve">                     </w:t>
+      </w:r>
+      <w:proofErr w:type="spellStart"/>
+      <w:r>
+        <w:t>JsonNode</w:t>
+      </w:r>
+      <w:proofErr w:type="spellEnd"/>
+      <w:r>
+        <w:t xml:space="preserve"> Tree </w:t>
+      </w:r>
+      <w:r>
+        <w:t xml:space="preserve">                  </w:t>
+      </w:r>
+      <w:r>
+        <w:t>Target DTO.</w:t>
+      </w:r>
+    </w:p>
+    <w:p>
+      <w:r>
+        <w:drawing>
+          <wp:inline distT="0" distB="0" distL="0" distR="0" wp14:anchorId="4E251B3A" wp14:editId="00925831">
+            <wp:extent cx="5731510" cy="539750"/>
+            <wp:effectExtent l="0" t="0" r="2540" b="0"/>
+            <wp:docPr id="1025320198" name="Picture 1"/>
+            <wp:cNvGraphicFramePr>
+              <a:graphicFrameLocks xmlns:a="http://schemas.openxmlformats.org/drawingml/2006/main" noChangeAspect="1"/>
+            </wp:cNvGraphicFramePr>
+            <a:graphic xmlns:a="http://schemas.openxmlformats.org/drawingml/2006/main">
+              <a:graphicData uri="http://schemas.openxmlformats.org/drawingml/2006/picture">
+                <pic:pic xmlns:pic="http://schemas.openxmlformats.org/drawingml/2006/picture">
+                  <pic:nvPicPr>
+                    <pic:cNvPr id="1025320198" name=""/>
+                    <pic:cNvPicPr/>
+                  </pic:nvPicPr>
+                  <pic:blipFill>
+                    <a:blip r:embed="rId7"/>
+                    <a:stretch>
+                      <a:fillRect/>
+                    </a:stretch>
+                  </pic:blipFill>
+                  <pic:spPr>
+                    <a:xfrm>
+                      <a:off x="0" y="0"/>
+                      <a:ext cx="5731510" cy="539750"/>
+                    </a:xfrm>
+                    <a:prstGeom prst="rect">
+                      <a:avLst/>
+                    </a:prstGeom>
+                  </pic:spPr>
+                </pic:pic>
+              </a:graphicData>
+            </a:graphic>
+          </wp:inline>
+        </w:drawing>
+      </w:r>
+    </w:p>
+    <w:p>
+      <w:r>
+        <w:t xml:space="preserve">This </w:t>
+      </w:r>
+      <w:r>
+        <w:rPr>
+          <w:b/>
+          <w:bCs/>
+          <w:highlight w:val="yellow"/>
+        </w:rPr>
+        <w:t>creates three temporary</w:t>
+      </w:r>
+      <w:r>
+        <w:t xml:space="preserve"> objects in memory </w:t>
+      </w:r>
+      <w:r>
+        <w:rPr>
+          <w:b/>
+          <w:bCs/>
+          <w:highlight w:val="yellow"/>
+        </w:rPr>
+        <w:t>just</w:t>
+      </w:r>
+      <w:r>
+        <w:t xml:space="preserve"> to map </w:t>
+      </w:r>
+      <w:r>
+        <w:rPr>
+          <w:b/>
+          <w:bCs/>
+          <w:highlight w:val="yellow"/>
+        </w:rPr>
+        <w:t>one</w:t>
+      </w:r>
+      <w:r>
+        <w:t xml:space="preserve"> object to another.</w:t>
+      </w:r>
+    </w:p>
+    <w:p>
+      <w:r>
+        <w:rPr>
+          <w:b/>
+          <w:bCs/>
+        </w:rPr>
+        <w:t>Recommendation:</w:t>
+      </w:r>
+      <w:r>
+        <w:t xml:space="preserve"> Use the </w:t>
+      </w:r>
+      <w:proofErr w:type="spellStart"/>
+      <w:r>
+        <w:t>convertValue</w:t>
+      </w:r>
+      <w:proofErr w:type="spellEnd"/>
+      <w:r>
+        <w:t xml:space="preserve"> method. It bypasses the expensive String serialization and </w:t>
+      </w:r>
+      <w:proofErr w:type="spellStart"/>
+      <w:r>
+        <w:t>readTree</w:t>
+      </w:r>
+      <w:proofErr w:type="spellEnd"/>
+      <w:r>
+        <w:t xml:space="preserve"> steps while achieving the same result.</w:t>
+      </w:r>
+    </w:p>
+    <w:p>
+      <w:r>
+        <w:pict w14:anchorId="2D737E2E">
+          <v:rect id="_x0000_i1117" style="width:0;height:1.5pt" o:hralign="center" o:hrstd="t" o:hrnoshade="t" o:hr="t" fillcolor="gray" stroked="f"/>
+        </w:pict>
+      </w:r>
+    </w:p>
+    <w:p>
+      <w:pPr>
+        <w:rPr>
+          <w:b/>
+          <w:bCs/>
+        </w:rPr>
+      </w:pPr>
+      <w:r>
+        <w:rPr>
+          <w:b/>
+          <w:bCs/>
+        </w:rPr>
+        <w:t>3. Optimized Code Version</w:t>
+      </w:r>
+    </w:p>
+    <w:p>
+      <w:r>
+        <w:t xml:space="preserve">Here is the refactored method using the shared </w:t>
+      </w:r>
+      <w:proofErr w:type="spellStart"/>
+      <w:r>
+        <w:t>objectMapper</w:t>
+      </w:r>
+      <w:proofErr w:type="spellEnd"/>
+      <w:r>
+        <w:t xml:space="preserve"> and more efficient mapping:</w:t>
+      </w:r>
+    </w:p>
+    <w:p>
+      <w:r>
+        <w:t>Java</w:t>
+      </w:r>
+    </w:p>
+    <w:p>
+      <w:pPr>
+        <w:pStyle w:val="NoSpacing"/>
+        <w:rPr>
+          <w:rFonts w:ascii="Bookman Old Style" w:hAnsi="Bookman Old Style"/>
+        </w:rPr>
+      </w:pPr>
+      <w:r>
+        <w:rPr>
+          <w:rFonts w:ascii="Bookman Old Style" w:hAnsi="Bookman Old Style"/>
+        </w:rPr>
+        <w:t xml:space="preserve">public </w:t>
+      </w:r>
+      <w:proofErr w:type="spellStart"/>
+      <w:r>
+        <w:rPr>
+          <w:rFonts w:ascii="Bookman Old Style" w:hAnsi="Bookman Old Style"/>
+        </w:rPr>
+        <w:t>ReissueSearchQueryDTO</w:t>
+      </w:r>
+      <w:proofErr w:type="spellEnd"/>
+      <w:r>
+        <w:rPr>
+          <w:rFonts w:ascii="Bookman Old Style" w:hAnsi="Bookman Old Style"/>
+        </w:rPr>
+        <w:t xml:space="preserve"> </w:t>
+      </w:r>
+      <w:proofErr w:type="spellStart"/>
+      <w:proofErr w:type="gramStart"/>
+      <w:r>
+        <w:rPr>
+          <w:rFonts w:ascii="Bookman Old Style" w:hAnsi="Bookman Old Style"/>
+          <w:b/>
+          <w:bCs/>
+        </w:rPr>
+        <w:t>convertTripjackRequestToJson</w:t>
+      </w:r>
+      <w:proofErr w:type="spellEnd"/>
+      <w:r>
+        <w:rPr>
+          <w:rFonts w:ascii="Bookman Old Style" w:hAnsi="Bookman Old Style"/>
+        </w:rPr>
+        <w:t>(</w:t>
+      </w:r>
+      <w:proofErr w:type="gramEnd"/>
+    </w:p>
+    <w:p>
+      <w:pPr>
+        <w:pStyle w:val="NoSpacing"/>
+        <w:rPr>
+          <w:rFonts w:ascii="Bookman Old Style" w:hAnsi="Bookman Old Style"/>
+          <w:sz w:val="20"/>
+          <w:szCs w:val="20"/>
+        </w:rPr>
+      </w:pPr>
+      <w:r>
+        <w:rPr>
+          <w:rFonts w:ascii="Bookman Old Style" w:hAnsi="Bookman Old Style"/>
+        </w:rPr>
+        <w:t xml:space="preserve">        </w:t>
+      </w:r>
+      <w:proofErr w:type="spellStart"/>
+      <w:r>
+        <w:rPr>
+          <w:rFonts w:ascii="Bookman Old Style" w:hAnsi="Bookman Old Style"/>
+          <w:sz w:val="20"/>
+          <w:szCs w:val="20"/>
+        </w:rPr>
+        <w:t>ReissueExploreFlightsRequestBaseDTO</w:t>
+      </w:r>
+      <w:proofErr w:type="spellEnd"/>
+      <w:r>
+        <w:rPr>
+          <w:rFonts w:ascii="Bookman Old Style" w:hAnsi="Bookman Old Style"/>
+          <w:sz w:val="20"/>
+          <w:szCs w:val="20"/>
+        </w:rPr>
+        <w:t xml:space="preserve"> </w:t>
+      </w:r>
+      <w:proofErr w:type="spellStart"/>
+      <w:r>
+        <w:rPr>
+          <w:rFonts w:ascii="Bookman Old Style" w:hAnsi="Bookman Old Style"/>
+          <w:sz w:val="20"/>
+          <w:szCs w:val="20"/>
+        </w:rPr>
+        <w:t>reissueExploreFlightsRequestDTO</w:t>
+      </w:r>
+      <w:proofErr w:type="spellEnd"/>
+      <w:r>
+        <w:rPr>
+          <w:rFonts w:ascii="Bookman Old Style" w:hAnsi="Bookman Old Style"/>
+          <w:sz w:val="20"/>
+          <w:szCs w:val="20"/>
+        </w:rPr>
+        <w:t>,</w:t>
+      </w:r>
+    </w:p>
+    <w:p>
+      <w:pPr>
+        <w:pStyle w:val="NoSpacing"/>
+        <w:rPr>
+          <w:rFonts w:ascii="Bookman Old Style" w:hAnsi="Bookman Old Style"/>
+          <w:sz w:val="20"/>
+          <w:szCs w:val="20"/>
+        </w:rPr>
+      </w:pPr>
+      <w:r>
+        <w:rPr>
+          <w:rFonts w:ascii="Bookman Old Style" w:hAnsi="Bookman Old Style"/>
+          <w:sz w:val="20"/>
+          <w:szCs w:val="20"/>
+        </w:rPr>
+        <w:t xml:space="preserve">        </w:t>
+      </w:r>
+      <w:proofErr w:type="spellStart"/>
+      <w:r>
+        <w:rPr>
+          <w:rFonts w:ascii="Bookman Old Style" w:hAnsi="Bookman Old Style"/>
+          <w:sz w:val="20"/>
+          <w:szCs w:val="20"/>
+        </w:rPr>
+        <w:t>ReissueSearchQueryDTO</w:t>
+      </w:r>
+      <w:proofErr w:type="spellEnd"/>
+      <w:r>
+        <w:rPr>
+          <w:rFonts w:ascii="Bookman Old Style" w:hAnsi="Bookman Old Style"/>
+          <w:sz w:val="20"/>
+          <w:szCs w:val="20"/>
+        </w:rPr>
+        <w:t xml:space="preserve"> </w:t>
+      </w:r>
+      <w:proofErr w:type="spellStart"/>
+      <w:r>
+        <w:rPr>
+          <w:rFonts w:ascii="Bookman Old Style" w:hAnsi="Bookman Old Style"/>
+          <w:sz w:val="20"/>
+          <w:szCs w:val="20"/>
+        </w:rPr>
+        <w:t>exploreFlightsRequestDTO</w:t>
+      </w:r>
+      <w:proofErr w:type="spellEnd"/>
+      <w:r>
+        <w:rPr>
+          <w:rFonts w:ascii="Bookman Old Style" w:hAnsi="Bookman Old Style"/>
+          <w:sz w:val="20"/>
+          <w:szCs w:val="20"/>
+        </w:rPr>
+        <w:t>) {</w:t>
+      </w:r>
+    </w:p>
+    <w:p>
+      <w:pPr>
+        <w:pStyle w:val="NoSpacing"/>
+        <w:rPr>
+          <w:rFonts w:ascii="Bookman Old Style" w:hAnsi="Bookman Old Style"/>
+          <w:sz w:val="20"/>
+          <w:szCs w:val="20"/>
+        </w:rPr>
+      </w:pPr>
+      <w:r>
+        <w:rPr>
+          <w:rFonts w:ascii="Bookman Old Style" w:hAnsi="Bookman Old Style"/>
+          <w:sz w:val="20"/>
+          <w:szCs w:val="20"/>
+        </w:rPr>
+        <w:t xml:space="preserve">       </w:t>
+      </w:r>
+      <w:proofErr w:type="gramStart"/>
+      <w:r>
+        <w:rPr>
+          <w:rFonts w:ascii="Bookman Old Style" w:hAnsi="Bookman Old Style"/>
+          <w:sz w:val="20"/>
+          <w:szCs w:val="20"/>
+        </w:rPr>
+        <w:t>logger.info(</w:t>
+      </w:r>
+      <w:proofErr w:type="gramEnd"/>
+      <w:r>
+        <w:rPr>
+          <w:rFonts w:ascii="Bookman Old Style" w:hAnsi="Bookman Old Style"/>
+          <w:sz w:val="20"/>
+          <w:szCs w:val="20"/>
+        </w:rPr>
+        <w:t xml:space="preserve">"Explore flights mapping started for request received from </w:t>
+      </w:r>
+      <w:proofErr w:type="spellStart"/>
+      <w:r>
+        <w:rPr>
+          <w:rFonts w:ascii="Bookman Old Style" w:hAnsi="Bookman Old Style"/>
+          <w:sz w:val="20"/>
+          <w:szCs w:val="20"/>
+        </w:rPr>
+        <w:t>rezair</w:t>
+      </w:r>
+      <w:proofErr w:type="spellEnd"/>
+      <w:r>
+        <w:rPr>
+          <w:rFonts w:ascii="Bookman Old Style" w:hAnsi="Bookman Old Style"/>
+          <w:sz w:val="20"/>
+          <w:szCs w:val="20"/>
+        </w:rPr>
+        <w:t xml:space="preserve"> to </w:t>
+      </w:r>
+      <w:proofErr w:type="spellStart"/>
+      <w:r>
+        <w:rPr>
+          <w:rFonts w:ascii="Bookman Old Style" w:hAnsi="Bookman Old Style"/>
+          <w:sz w:val="20"/>
+          <w:szCs w:val="20"/>
+        </w:rPr>
+        <w:t>tripjack</w:t>
+      </w:r>
+      <w:proofErr w:type="spellEnd"/>
+      <w:r>
+        <w:rPr>
+          <w:rFonts w:ascii="Bookman Old Style" w:hAnsi="Bookman Old Style"/>
+          <w:sz w:val="20"/>
+          <w:szCs w:val="20"/>
+        </w:rPr>
+        <w:t>"</w:t>
+      </w:r>
+      <w:proofErr w:type="gramStart"/>
+      <w:r>
+        <w:rPr>
+          <w:rFonts w:ascii="Bookman Old Style" w:hAnsi="Bookman Old Style"/>
+          <w:sz w:val="20"/>
+          <w:szCs w:val="20"/>
+        </w:rPr>
+        <w:t>);</w:t>
+      </w:r>
+      <w:proofErr w:type="gramEnd"/>
+    </w:p>
+    <w:p>
+      <w:pPr>
+        <w:pStyle w:val="NoSpacing"/>
+        <w:rPr>
+          <w:rFonts w:ascii="Bookman Old Style" w:hAnsi="Bookman Old Style"/>
+        </w:rPr>
+      </w:pPr>
+    </w:p>
+    <w:p>
+      <w:pPr>
+        <w:pStyle w:val="NoSpacing"/>
+        <w:rPr>
+          <w:rFonts w:ascii="Bookman Old Style" w:hAnsi="Bookman Old Style"/>
+        </w:rPr>
+      </w:pPr>
+      <w:r>
+        <w:rPr>
+          <w:rFonts w:ascii="Bookman Old Style" w:hAnsi="Bookman Old Style"/>
+        </w:rPr>
+        <w:t xml:space="preserve">       try {</w:t>
+      </w:r>
+    </w:p>
+    <w:p>
+      <w:pPr>
+        <w:pStyle w:val="NoSpacing"/>
+        <w:ind w:left="720"/>
+        <w:rPr>
+          <w:rFonts w:ascii="Bookman Old Style" w:hAnsi="Bookman Old Style"/>
+        </w:rPr>
+      </w:pPr>
+      <w:r>
+        <w:rPr>
+          <w:rFonts w:ascii="Bookman Old Style" w:hAnsi="Bookman Old Style"/>
+        </w:rPr>
+        <w:t xml:space="preserve">        // </w:t>
+      </w:r>
+      <w:r>
+        <w:rPr>
+          <w:rFonts w:ascii="Bookman Old Style" w:hAnsi="Bookman Old Style"/>
+          <w:color w:val="767171" w:themeColor="background2" w:themeShade="80"/>
+          <w:highlight w:val="yellow"/>
+        </w:rPr>
+        <w:t xml:space="preserve">Direct conversion </w:t>
+      </w:r>
+      <w:r>
+        <w:rPr>
+          <w:rFonts w:ascii="Bookman Old Style" w:hAnsi="Bookman Old Style"/>
+          <w:b/>
+          <w:bCs/>
+          <w:color w:val="767171" w:themeColor="background2" w:themeShade="80"/>
+          <w:highlight w:val="yellow"/>
+        </w:rPr>
+        <w:t>without</w:t>
+      </w:r>
+      <w:r>
+        <w:rPr>
+          <w:rFonts w:ascii="Bookman Old Style" w:hAnsi="Bookman Old Style"/>
+          <w:color w:val="767171" w:themeColor="background2" w:themeShade="80"/>
+          <w:highlight w:val="yellow"/>
+        </w:rPr>
+        <w:t xml:space="preserve"> intermediate JSON strings or Trees</w:t>
+      </w:r>
+    </w:p>
+    <w:p>
+      <w:pPr>
+        <w:pStyle w:val="NoSpacing"/>
+        <w:ind w:left="720"/>
+        <w:rPr>
+          <w:rFonts w:ascii="Bookman Old Style" w:hAnsi="Bookman Old Style"/>
+          <w:sz w:val="20"/>
+          <w:szCs w:val="20"/>
+        </w:rPr>
+      </w:pPr>
+      <w:r>
+        <w:rPr>
+          <w:rFonts w:ascii="Bookman Old Style" w:hAnsi="Bookman Old Style"/>
+        </w:rPr>
+        <w:t xml:space="preserve">        </w:t>
+      </w:r>
+      <w:proofErr w:type="spellStart"/>
+      <w:r>
+        <w:rPr>
+          <w:rFonts w:ascii="Bookman Old Style" w:hAnsi="Bookman Old Style"/>
+          <w:sz w:val="20"/>
+          <w:szCs w:val="20"/>
+        </w:rPr>
+        <w:t>ReissueSearchQueryDTO</w:t>
+      </w:r>
+      <w:proofErr w:type="spellEnd"/>
+      <w:r>
+        <w:rPr>
+          <w:rFonts w:ascii="Bookman Old Style" w:hAnsi="Bookman Old Style"/>
+          <w:sz w:val="20"/>
+          <w:szCs w:val="20"/>
+        </w:rPr>
+        <w:t xml:space="preserve"> </w:t>
+      </w:r>
+      <w:proofErr w:type="spellStart"/>
+      <w:r>
+        <w:rPr>
+          <w:rFonts w:ascii="Bookman Old Style" w:hAnsi="Bookman Old Style"/>
+          <w:sz w:val="20"/>
+          <w:szCs w:val="20"/>
+        </w:rPr>
+        <w:t>searchQuery</w:t>
+      </w:r>
+      <w:proofErr w:type="spellEnd"/>
+      <w:r>
+        <w:rPr>
+          <w:rFonts w:ascii="Bookman Old Style" w:hAnsi="Bookman Old Style"/>
+          <w:sz w:val="20"/>
+          <w:szCs w:val="20"/>
+        </w:rPr>
+        <w:t xml:space="preserve"> = </w:t>
+      </w:r>
+      <w:proofErr w:type="spellStart"/>
+      <w:r>
+        <w:rPr>
+          <w:rFonts w:ascii="Bookman Old Style" w:hAnsi="Bookman Old Style"/>
+          <w:sz w:val="20"/>
+          <w:szCs w:val="20"/>
+        </w:rPr>
+        <w:t>objectMapper.convertValue</w:t>
+      </w:r>
+      <w:proofErr w:type="spellEnd"/>
+      <w:r>
+        <w:rPr>
+          <w:rFonts w:ascii="Bookman Old Style" w:hAnsi="Bookman Old Style"/>
+          <w:sz w:val="20"/>
+          <w:szCs w:val="20"/>
+        </w:rPr>
+        <w:t>(</w:t>
+      </w:r>
+    </w:p>
+    <w:p>
+      <w:pPr>
+        <w:pStyle w:val="NoSpacing"/>
+        <w:ind w:left="720"/>
+        <w:rPr>
+          <w:rFonts w:ascii="Bookman Old Style" w:hAnsi="Bookman Old Style"/>
+          <w:sz w:val="20"/>
+          <w:szCs w:val="20"/>
+        </w:rPr>
+      </w:pPr>
+      <w:r>
+        <w:rPr>
+          <w:rFonts w:ascii="Bookman Old Style" w:hAnsi="Bookman Old Style"/>
+          <w:sz w:val="20"/>
+          <w:szCs w:val="20"/>
+        </w:rPr>
+        <w:t xml:space="preserve">            </w:t>
+      </w:r>
+      <w:proofErr w:type="spellStart"/>
+      <w:r>
+        <w:rPr>
+          <w:rFonts w:ascii="Bookman Old Style" w:hAnsi="Bookman Old Style"/>
+          <w:sz w:val="20"/>
+          <w:szCs w:val="20"/>
+        </w:rPr>
+        <w:t>reissueExploreFlightsRequestDTO</w:t>
+      </w:r>
+      <w:proofErr w:type="spellEnd"/>
+      <w:r>
+        <w:rPr>
+          <w:rFonts w:ascii="Bookman Old Style" w:hAnsi="Bookman Old Style"/>
+          <w:sz w:val="20"/>
+          <w:szCs w:val="20"/>
+        </w:rPr>
+        <w:t xml:space="preserve">, </w:t>
+      </w:r>
+    </w:p>
+    <w:p>
+      <w:pPr>
+        <w:pStyle w:val="NoSpacing"/>
+        <w:ind w:left="720"/>
+        <w:rPr>
+          <w:rFonts w:ascii="Bookman Old Style" w:hAnsi="Bookman Old Style"/>
+          <w:sz w:val="20"/>
+          <w:szCs w:val="20"/>
+        </w:rPr>
+      </w:pPr>
+      <w:r>
+        <w:rPr>
+          <w:rFonts w:ascii="Bookman Old Style" w:hAnsi="Bookman Old Style"/>
+          <w:sz w:val="20"/>
+          <w:szCs w:val="20"/>
+        </w:rPr>
+        <w:t xml:space="preserve">            </w:t>
+      </w:r>
+      <w:proofErr w:type="spellStart"/>
+      <w:r>
+        <w:rPr>
+          <w:rFonts w:ascii="Bookman Old Style" w:hAnsi="Bookman Old Style"/>
+          <w:sz w:val="20"/>
+          <w:szCs w:val="20"/>
+        </w:rPr>
+        <w:t>ReissueSearchQueryDTO.class</w:t>
+      </w:r>
+      <w:proofErr w:type="spellEnd"/>
+    </w:p>
+    <w:p>
+      <w:pPr>
+        <w:pStyle w:val="NoSpacing"/>
+        <w:ind w:left="720"/>
+        <w:rPr>
+          <w:rFonts w:ascii="Bookman Old Style" w:hAnsi="Bookman Old Style"/>
+          <w:sz w:val="20"/>
+          <w:szCs w:val="20"/>
+        </w:rPr>
+      </w:pPr>
+      <w:r>
+        <w:rPr>
+          <w:rFonts w:ascii="Bookman Old Style" w:hAnsi="Bookman Old Style"/>
+          <w:sz w:val="20"/>
+          <w:szCs w:val="20"/>
+        </w:rPr>
+        <w:t xml:space="preserve">        </w:t>
+      </w:r>
+      <w:proofErr w:type="gramStart"/>
+      <w:r>
+        <w:rPr>
+          <w:rFonts w:ascii="Bookman Old Style" w:hAnsi="Bookman Old Style"/>
+          <w:sz w:val="20"/>
+          <w:szCs w:val="20"/>
+        </w:rPr>
+        <w:t>);</w:t>
+      </w:r>
+      <w:proofErr w:type="gramEnd"/>
+    </w:p>
+    <w:p>
+      <w:pPr>
+        <w:pStyle w:val="NoSpacing"/>
+        <w:rPr>
+          <w:rFonts w:ascii="Bookman Old Style" w:hAnsi="Bookman Old Style"/>
+        </w:rPr>
+      </w:pPr>
+    </w:p>
+    <w:p>
+      <w:pPr>
+        <w:pStyle w:val="NoSpacing"/>
+        <w:rPr>
+          <w:rFonts w:ascii="Bookman Old Style" w:hAnsi="Bookman Old Style"/>
+          <w:sz w:val="20"/>
+          <w:szCs w:val="20"/>
+        </w:rPr>
+      </w:pPr>
+      <w:r>
+        <w:rPr>
+          <w:rFonts w:ascii="Bookman Old Style" w:hAnsi="Bookman Old Style"/>
+          <w:sz w:val="20"/>
+          <w:szCs w:val="20"/>
+        </w:rPr>
+        <w:t xml:space="preserve">        </w:t>
+      </w:r>
+      <w:proofErr w:type="spellStart"/>
+      <w:proofErr w:type="gramStart"/>
+      <w:r>
+        <w:rPr>
+          <w:rFonts w:ascii="Bookman Old Style" w:hAnsi="Bookman Old Style"/>
+          <w:sz w:val="20"/>
+          <w:szCs w:val="20"/>
+        </w:rPr>
+        <w:t>setPaxDetails</w:t>
+      </w:r>
+      <w:proofErr w:type="spellEnd"/>
+      <w:r>
+        <w:rPr>
+          <w:rFonts w:ascii="Bookman Old Style" w:hAnsi="Bookman Old Style"/>
+          <w:sz w:val="20"/>
+          <w:szCs w:val="20"/>
+        </w:rPr>
+        <w:t>(</w:t>
+      </w:r>
+      <w:proofErr w:type="spellStart"/>
+      <w:proofErr w:type="gramEnd"/>
+      <w:r>
+        <w:rPr>
+          <w:rFonts w:ascii="Bookman Old Style" w:hAnsi="Bookman Old Style"/>
+          <w:sz w:val="20"/>
+          <w:szCs w:val="20"/>
+        </w:rPr>
+        <w:t>reissueExploreFlightsRequestDTO</w:t>
+      </w:r>
+      <w:proofErr w:type="spellEnd"/>
+      <w:r>
+        <w:rPr>
+          <w:rFonts w:ascii="Bookman Old Style" w:hAnsi="Bookman Old Style"/>
+          <w:sz w:val="20"/>
+          <w:szCs w:val="20"/>
+        </w:rPr>
+        <w:t xml:space="preserve">, </w:t>
+      </w:r>
+      <w:proofErr w:type="spellStart"/>
+      <w:r>
+        <w:rPr>
+          <w:rFonts w:ascii="Bookman Old Style" w:hAnsi="Bookman Old Style"/>
+          <w:sz w:val="20"/>
+          <w:szCs w:val="20"/>
+        </w:rPr>
+        <w:t>searchQuery</w:t>
+      </w:r>
+      <w:proofErr w:type="spellEnd"/>
+      <w:proofErr w:type="gramStart"/>
+      <w:r>
+        <w:rPr>
+          <w:rFonts w:ascii="Bookman Old Style" w:hAnsi="Bookman Old Style"/>
+          <w:sz w:val="20"/>
+          <w:szCs w:val="20"/>
+        </w:rPr>
+        <w:t>);</w:t>
+      </w:r>
+      <w:proofErr w:type="gramEnd"/>
+    </w:p>
+    <w:p>
+      <w:pPr>
+        <w:pStyle w:val="NoSpacing"/>
+        <w:rPr>
+          <w:rFonts w:ascii="Bookman Old Style" w:hAnsi="Bookman Old Style"/>
+          <w:sz w:val="20"/>
+          <w:szCs w:val="20"/>
+        </w:rPr>
+      </w:pPr>
+      <w:r>
+        <w:rPr>
+          <w:rFonts w:ascii="Bookman Old Style" w:hAnsi="Bookman Old Style"/>
+          <w:sz w:val="20"/>
+          <w:szCs w:val="20"/>
+        </w:rPr>
+        <w:t xml:space="preserve">        </w:t>
+      </w:r>
+      <w:proofErr w:type="spellStart"/>
+      <w:proofErr w:type="gramStart"/>
+      <w:r>
+        <w:rPr>
+          <w:rFonts w:ascii="Bookman Old Style" w:hAnsi="Bookman Old Style"/>
+          <w:sz w:val="20"/>
+          <w:szCs w:val="20"/>
+        </w:rPr>
+        <w:t>setRouteInfos</w:t>
+      </w:r>
+      <w:proofErr w:type="spellEnd"/>
+      <w:r>
+        <w:rPr>
+          <w:rFonts w:ascii="Bookman Old Style" w:hAnsi="Bookman Old Style"/>
+          <w:sz w:val="20"/>
+          <w:szCs w:val="20"/>
+        </w:rPr>
+        <w:t>(</w:t>
+      </w:r>
+      <w:proofErr w:type="spellStart"/>
+      <w:proofErr w:type="gramEnd"/>
+      <w:r>
+        <w:rPr>
+          <w:rFonts w:ascii="Bookman Old Style" w:hAnsi="Bookman Old Style"/>
+          <w:sz w:val="20"/>
+          <w:szCs w:val="20"/>
+        </w:rPr>
+        <w:t>reissueExploreFlightsRequestDTO</w:t>
+      </w:r>
+      <w:proofErr w:type="spellEnd"/>
+      <w:r>
+        <w:rPr>
+          <w:rFonts w:ascii="Bookman Old Style" w:hAnsi="Bookman Old Style"/>
+          <w:sz w:val="20"/>
+          <w:szCs w:val="20"/>
+        </w:rPr>
+        <w:t xml:space="preserve">, </w:t>
+      </w:r>
+      <w:proofErr w:type="spellStart"/>
+      <w:r>
+        <w:rPr>
+          <w:rFonts w:ascii="Bookman Old Style" w:hAnsi="Bookman Old Style"/>
+          <w:sz w:val="20"/>
+          <w:szCs w:val="20"/>
+        </w:rPr>
+        <w:t>searchQuery</w:t>
+      </w:r>
+      <w:proofErr w:type="spellEnd"/>
+      <w:proofErr w:type="gramStart"/>
+      <w:r>
+        <w:rPr>
+          <w:rFonts w:ascii="Bookman Old Style" w:hAnsi="Bookman Old Style"/>
+          <w:sz w:val="20"/>
+          <w:szCs w:val="20"/>
+        </w:rPr>
+        <w:t>);</w:t>
+      </w:r>
+      <w:proofErr w:type="gramEnd"/>
+    </w:p>
+    <w:p>
+      <w:pPr>
+        <w:pStyle w:val="NoSpacing"/>
+        <w:rPr>
+          <w:rFonts w:ascii="Bookman Old Style" w:hAnsi="Bookman Old Style"/>
+        </w:rPr>
+      </w:pPr>
+    </w:p>
+    <w:p>
+      <w:pPr>
+        <w:pStyle w:val="NoSpacing"/>
+        <w:rPr>
+          <w:rFonts w:ascii="Bookman Old Style" w:hAnsi="Bookman Old Style"/>
+          <w:sz w:val="20"/>
+          <w:szCs w:val="20"/>
+        </w:rPr>
+      </w:pPr>
+      <w:r>
+        <w:rPr>
+          <w:rFonts w:ascii="Bookman Old Style" w:hAnsi="Bookman Old Style"/>
+          <w:sz w:val="20"/>
+          <w:szCs w:val="20"/>
+        </w:rPr>
+        <w:t xml:space="preserve">        searchQuery.setPaxIds(reissueExploreFlightsRequestDTO.getPaxIds()</w:t>
+      </w:r>
+      <w:proofErr w:type="gramStart"/>
+      <w:r>
+        <w:rPr>
+          <w:rFonts w:ascii="Bookman Old Style" w:hAnsi="Bookman Old Style"/>
+          <w:sz w:val="20"/>
+          <w:szCs w:val="20"/>
+        </w:rPr>
+        <w:t>);</w:t>
+      </w:r>
+      <w:proofErr w:type="gramEnd"/>
+    </w:p>
+    <w:p>
+      <w:pPr>
+        <w:pStyle w:val="NoSpacing"/>
+        <w:rPr>
+          <w:rFonts w:ascii="Bookman Old Style" w:hAnsi="Bookman Old Style"/>
+          <w:sz w:val="20"/>
+          <w:szCs w:val="20"/>
+        </w:rPr>
+      </w:pPr>
+      <w:r>
+        <w:rPr>
+          <w:rFonts w:ascii="Bookman Old Style" w:hAnsi="Bookman Old Style"/>
+          <w:sz w:val="20"/>
+          <w:szCs w:val="20"/>
+        </w:rPr>
+        <w:t xml:space="preserve">        searchQuery.setOldBookingId(reissueExploreFlightsRequestDTO.getOldBookingId()</w:t>
+      </w:r>
+      <w:proofErr w:type="gramStart"/>
+      <w:r>
+        <w:rPr>
+          <w:rFonts w:ascii="Bookman Old Style" w:hAnsi="Bookman Old Style"/>
+          <w:sz w:val="20"/>
+          <w:szCs w:val="20"/>
+        </w:rPr>
+        <w:t>);</w:t>
+      </w:r>
+      <w:proofErr w:type="gramEnd"/>
+    </w:p>
+    <w:p>
+      <w:pPr>
+        <w:pStyle w:val="NoSpacing"/>
+        <w:rPr>
+          <w:rFonts w:ascii="Bookman Old Style" w:hAnsi="Bookman Old Style"/>
+          <w:sz w:val="20"/>
+          <w:szCs w:val="20"/>
+        </w:rPr>
+      </w:pPr>
+      <w:r>
+        <w:rPr>
+          <w:rFonts w:ascii="Bookman Old Style" w:hAnsi="Bookman Old Style"/>
+          <w:sz w:val="20"/>
+          <w:szCs w:val="20"/>
+        </w:rPr>
+        <w:t xml:space="preserve">        </w:t>
+      </w:r>
+      <w:proofErr w:type="spellStart"/>
+      <w:r>
+        <w:rPr>
+          <w:rFonts w:ascii="Bookman Old Style" w:hAnsi="Bookman Old Style"/>
+          <w:sz w:val="20"/>
+          <w:szCs w:val="20"/>
+        </w:rPr>
+        <w:t>searchQuery.setPnr</w:t>
+      </w:r>
+      <w:proofErr w:type="spellEnd"/>
+      <w:r>
+        <w:rPr>
+          <w:rFonts w:ascii="Bookman Old Style" w:hAnsi="Bookman Old Style"/>
+          <w:sz w:val="20"/>
+          <w:szCs w:val="20"/>
+        </w:rPr>
+        <w:t>(</w:t>
+      </w:r>
+      <w:proofErr w:type="spellStart"/>
+      <w:r>
+        <w:rPr>
+          <w:rFonts w:ascii="Bookman Old Style" w:hAnsi="Bookman Old Style"/>
+          <w:sz w:val="20"/>
+          <w:szCs w:val="20"/>
+        </w:rPr>
+        <w:t>reissueExploreFlightsRequestDTO.getPnr</w:t>
+      </w:r>
+      <w:proofErr w:type="spellEnd"/>
+      <w:r>
+        <w:rPr>
+          <w:rFonts w:ascii="Bookman Old Style" w:hAnsi="Bookman Old Style"/>
+          <w:sz w:val="20"/>
+          <w:szCs w:val="20"/>
+        </w:rPr>
+        <w:t>()</w:t>
+      </w:r>
+      <w:proofErr w:type="gramStart"/>
+      <w:r>
+        <w:rPr>
+          <w:rFonts w:ascii="Bookman Old Style" w:hAnsi="Bookman Old Style"/>
+          <w:sz w:val="20"/>
+          <w:szCs w:val="20"/>
+        </w:rPr>
+        <w:t>);</w:t>
+      </w:r>
+      <w:proofErr w:type="gramEnd"/>
+    </w:p>
+    <w:p>
+      <w:pPr>
+        <w:pStyle w:val="NoSpacing"/>
+        <w:rPr>
+          <w:rFonts w:ascii="Bookman Old Style" w:hAnsi="Bookman Old Style"/>
+          <w:sz w:val="20"/>
+          <w:szCs w:val="20"/>
+        </w:rPr>
+      </w:pPr>
+      <w:r>
+        <w:rPr>
+          <w:rFonts w:ascii="Bookman Old Style" w:hAnsi="Bookman Old Style"/>
+          <w:sz w:val="20"/>
+          <w:szCs w:val="20"/>
+        </w:rPr>
+        <w:t xml:space="preserve">        </w:t>
+      </w:r>
+    </w:p>
+    <w:p>
+      <w:pPr>
+        <w:pStyle w:val="NoSpacing"/>
+        <w:rPr>
+          <w:rFonts w:ascii="Bookman Old Style" w:hAnsi="Bookman Old Style"/>
+          <w:sz w:val="20"/>
+          <w:szCs w:val="20"/>
+        </w:rPr>
+      </w:pPr>
+      <w:r>
+        <w:rPr>
+          <w:rFonts w:ascii="Bookman Old Style" w:hAnsi="Bookman Old Style"/>
+          <w:sz w:val="20"/>
+          <w:szCs w:val="20"/>
+        </w:rPr>
+        <w:t xml:space="preserve">        </w:t>
+      </w:r>
+      <w:proofErr w:type="gramStart"/>
+      <w:r>
+        <w:rPr>
+          <w:rFonts w:ascii="Bookman Old Style" w:hAnsi="Bookman Old Style"/>
+          <w:sz w:val="20"/>
+          <w:szCs w:val="20"/>
+        </w:rPr>
+        <w:t>logger.info(</w:t>
+      </w:r>
+      <w:proofErr w:type="gramEnd"/>
+      <w:r>
+        <w:rPr>
+          <w:rFonts w:ascii="Bookman Old Style" w:hAnsi="Bookman Old Style"/>
+          <w:sz w:val="20"/>
+          <w:szCs w:val="20"/>
+        </w:rPr>
+        <w:t xml:space="preserve">"Explore flights mapping completed for request received from </w:t>
+      </w:r>
+      <w:proofErr w:type="spellStart"/>
+      <w:r>
+        <w:rPr>
+          <w:rFonts w:ascii="Bookman Old Style" w:hAnsi="Bookman Old Style"/>
+          <w:sz w:val="20"/>
+          <w:szCs w:val="20"/>
+        </w:rPr>
+        <w:t>rezair</w:t>
+      </w:r>
+      <w:proofErr w:type="spellEnd"/>
+      <w:r>
+        <w:rPr>
+          <w:rFonts w:ascii="Bookman Old Style" w:hAnsi="Bookman Old Style"/>
+          <w:sz w:val="20"/>
+          <w:szCs w:val="20"/>
+        </w:rPr>
+        <w:t>"</w:t>
+      </w:r>
+      <w:proofErr w:type="gramStart"/>
+      <w:r>
+        <w:rPr>
+          <w:rFonts w:ascii="Bookman Old Style" w:hAnsi="Bookman Old Style"/>
+          <w:sz w:val="20"/>
+          <w:szCs w:val="20"/>
+        </w:rPr>
+        <w:t>);</w:t>
+      </w:r>
+      <w:proofErr w:type="gramEnd"/>
+    </w:p>
+    <w:p>
+      <w:pPr>
+        <w:pStyle w:val="NoSpacing"/>
+        <w:rPr>
+          <w:rFonts w:ascii="Bookman Old Style" w:hAnsi="Bookman Old Style"/>
+          <w:sz w:val="20"/>
+          <w:szCs w:val="20"/>
+        </w:rPr>
+      </w:pPr>
+      <w:r>
+        <w:rPr>
+          <w:rFonts w:ascii="Bookman Old Style" w:hAnsi="Bookman Old Style"/>
+          <w:sz w:val="20"/>
+          <w:szCs w:val="20"/>
+        </w:rPr>
+        <w:t xml:space="preserve">        return </w:t>
+      </w:r>
+      <w:proofErr w:type="spellStart"/>
+      <w:proofErr w:type="gramStart"/>
+      <w:r>
+        <w:rPr>
+          <w:rFonts w:ascii="Bookman Old Style" w:hAnsi="Bookman Old Style"/>
+          <w:sz w:val="20"/>
+          <w:szCs w:val="20"/>
+        </w:rPr>
+        <w:t>searchQuery</w:t>
+      </w:r>
+      <w:proofErr w:type="spellEnd"/>
+      <w:r>
+        <w:rPr>
+          <w:rFonts w:ascii="Bookman Old Style" w:hAnsi="Bookman Old Style"/>
+          <w:sz w:val="20"/>
+          <w:szCs w:val="20"/>
+        </w:rPr>
+        <w:t>;</w:t>
+      </w:r>
+      <w:proofErr w:type="gramEnd"/>
+    </w:p>
+    <w:p>
+      <w:pPr>
+        <w:pStyle w:val="NoSpacing"/>
+        <w:rPr>
+          <w:rFonts w:ascii="Bookman Old Style" w:hAnsi="Bookman Old Style"/>
+          <w:sz w:val="20"/>
+          <w:szCs w:val="20"/>
+        </w:rPr>
+      </w:pPr>
+    </w:p>
+    <w:p>
+      <w:pPr>
+        <w:pStyle w:val="NoSpacing"/>
+        <w:rPr>
+          <w:rFonts w:ascii="Bookman Old Style" w:hAnsi="Bookman Old Style"/>
+          <w:sz w:val="20"/>
+          <w:szCs w:val="20"/>
+        </w:rPr>
+      </w:pPr>
+      <w:r>
+        <w:rPr>
+          <w:rFonts w:ascii="Bookman Old Style" w:hAnsi="Bookman Old Style"/>
+          <w:sz w:val="20"/>
+          <w:szCs w:val="20"/>
+        </w:rPr>
+        <w:t xml:space="preserve">    } catch (</w:t>
+      </w:r>
+      <w:proofErr w:type="spellStart"/>
+      <w:r>
+        <w:rPr>
+          <w:rFonts w:ascii="Bookman Old Style" w:hAnsi="Bookman Old Style"/>
+          <w:sz w:val="20"/>
+          <w:szCs w:val="20"/>
+        </w:rPr>
+        <w:t>IllegalArgumentException</w:t>
+      </w:r>
+      <w:proofErr w:type="spellEnd"/>
+      <w:r>
+        <w:rPr>
+          <w:rFonts w:ascii="Bookman Old Style" w:hAnsi="Bookman Old Style"/>
+          <w:sz w:val="20"/>
+          <w:szCs w:val="20"/>
+        </w:rPr>
+        <w:t xml:space="preserve"> ex) </w:t>
+      </w:r>
+      <w:proofErr w:type="gramStart"/>
+      <w:r>
+        <w:rPr>
+          <w:rFonts w:ascii="Bookman Old Style" w:hAnsi="Bookman Old Style"/>
+          <w:sz w:val="20"/>
+          <w:szCs w:val="20"/>
+        </w:rPr>
+        <w:t>{ /</w:t>
+      </w:r>
+      <w:proofErr w:type="gramEnd"/>
+      <w:r>
+        <w:rPr>
+          <w:rFonts w:ascii="Bookman Old Style" w:hAnsi="Bookman Old Style"/>
+          <w:sz w:val="20"/>
+          <w:szCs w:val="20"/>
+        </w:rPr>
+        <w:t xml:space="preserve">/ </w:t>
+      </w:r>
+      <w:proofErr w:type="spellStart"/>
+      <w:r>
+        <w:rPr>
+          <w:rFonts w:ascii="Bookman Old Style" w:hAnsi="Bookman Old Style"/>
+          <w:sz w:val="20"/>
+          <w:szCs w:val="20"/>
+        </w:rPr>
+        <w:t>convertValue</w:t>
+      </w:r>
+      <w:proofErr w:type="spellEnd"/>
+      <w:r>
+        <w:rPr>
+          <w:rFonts w:ascii="Bookman Old Style" w:hAnsi="Bookman Old Style"/>
+          <w:sz w:val="20"/>
+          <w:szCs w:val="20"/>
+        </w:rPr>
+        <w:t xml:space="preserve"> throws </w:t>
+      </w:r>
+      <w:proofErr w:type="spellStart"/>
+      <w:r>
+        <w:rPr>
+          <w:rFonts w:ascii="Bookman Old Style" w:hAnsi="Bookman Old Style"/>
+          <w:sz w:val="20"/>
+          <w:szCs w:val="20"/>
+        </w:rPr>
+        <w:t>IllegalArgumentException</w:t>
+      </w:r>
+      <w:proofErr w:type="spellEnd"/>
+      <w:r>
+        <w:rPr>
+          <w:rFonts w:ascii="Bookman Old Style" w:hAnsi="Bookman Old Style"/>
+          <w:sz w:val="20"/>
+          <w:szCs w:val="20"/>
+        </w:rPr>
+        <w:t xml:space="preserve"> if mapping fails</w:t>
+      </w:r>
+    </w:p>
+    <w:p>
+      <w:pPr>
+        <w:pStyle w:val="NoSpacing"/>
+        <w:rPr>
+          <w:rFonts w:ascii="Bookman Old Style" w:hAnsi="Bookman Old Style"/>
+          <w:sz w:val="20"/>
+          <w:szCs w:val="20"/>
+        </w:rPr>
+      </w:pPr>
+      <w:r>
+        <w:rPr>
+          <w:rFonts w:ascii="Bookman Old Style" w:hAnsi="Bookman Old Style"/>
+          <w:sz w:val="20"/>
+          <w:szCs w:val="20"/>
+        </w:rPr>
+        <w:t xml:space="preserve">        </w:t>
+      </w:r>
+      <w:proofErr w:type="spellStart"/>
+      <w:proofErr w:type="gramStart"/>
+      <w:r>
+        <w:rPr>
+          <w:rFonts w:ascii="Bookman Old Style" w:hAnsi="Bookman Old Style"/>
+          <w:sz w:val="20"/>
+          <w:szCs w:val="20"/>
+        </w:rPr>
+        <w:t>logger.error</w:t>
+      </w:r>
+      <w:proofErr w:type="spellEnd"/>
+      <w:proofErr w:type="gramEnd"/>
+      <w:r>
+        <w:rPr>
+          <w:rFonts w:ascii="Bookman Old Style" w:hAnsi="Bookman Old Style"/>
+          <w:sz w:val="20"/>
+          <w:szCs w:val="20"/>
+        </w:rPr>
+        <w:t>(</w:t>
+      </w:r>
+      <w:proofErr w:type="spellStart"/>
+      <w:r>
+        <w:rPr>
+          <w:rFonts w:ascii="Bookman Old Style" w:hAnsi="Bookman Old Style"/>
+          <w:sz w:val="20"/>
+          <w:szCs w:val="20"/>
+        </w:rPr>
+        <w:t>TripjackConstant.JSON_EXCEPTION_LOGGER</w:t>
+      </w:r>
+      <w:proofErr w:type="spellEnd"/>
+      <w:r>
+        <w:rPr>
+          <w:rFonts w:ascii="Bookman Old Style" w:hAnsi="Bookman Old Style"/>
+          <w:sz w:val="20"/>
+          <w:szCs w:val="20"/>
+        </w:rPr>
+        <w:t xml:space="preserve">, </w:t>
+      </w:r>
+      <w:proofErr w:type="spellStart"/>
+      <w:proofErr w:type="gramStart"/>
+      <w:r>
+        <w:rPr>
+          <w:rFonts w:ascii="Bookman Old Style" w:hAnsi="Bookman Old Style"/>
+          <w:sz w:val="20"/>
+          <w:szCs w:val="20"/>
+        </w:rPr>
+        <w:t>ex.getMessage</w:t>
+      </w:r>
+      <w:proofErr w:type="spellEnd"/>
+      <w:proofErr w:type="gramEnd"/>
+      <w:r>
+        <w:rPr>
+          <w:rFonts w:ascii="Bookman Old Style" w:hAnsi="Bookman Old Style"/>
+          <w:sz w:val="20"/>
+          <w:szCs w:val="20"/>
+        </w:rPr>
+        <w:t>()</w:t>
+      </w:r>
+      <w:proofErr w:type="gramStart"/>
+      <w:r>
+        <w:rPr>
+          <w:rFonts w:ascii="Bookman Old Style" w:hAnsi="Bookman Old Style"/>
+          <w:sz w:val="20"/>
+          <w:szCs w:val="20"/>
+        </w:rPr>
+        <w:t>);</w:t>
+      </w:r>
+      <w:proofErr w:type="gramEnd"/>
+    </w:p>
+    <w:p>
+      <w:pPr>
+        <w:pStyle w:val="NoSpacing"/>
+        <w:rPr>
+          <w:rFonts w:ascii="Bookman Old Style" w:hAnsi="Bookman Old Style"/>
+        </w:rPr>
+      </w:pPr>
+      <w:r>
+        <w:rPr>
+          <w:rFonts w:ascii="Bookman Old Style" w:hAnsi="Bookman Old Style"/>
+          <w:sz w:val="20"/>
+          <w:szCs w:val="20"/>
+        </w:rPr>
+        <w:t xml:space="preserve">        throw new </w:t>
+      </w:r>
+      <w:proofErr w:type="spellStart"/>
+      <w:proofErr w:type="gramStart"/>
+      <w:r>
+        <w:rPr>
+          <w:rFonts w:ascii="Bookman Old Style" w:hAnsi="Bookman Old Style"/>
+          <w:sz w:val="20"/>
+          <w:szCs w:val="20"/>
+        </w:rPr>
+        <w:t>RuntimeException</w:t>
+      </w:r>
+      <w:proofErr w:type="spellEnd"/>
+      <w:r>
+        <w:rPr>
+          <w:rFonts w:ascii="Bookman Old Style" w:hAnsi="Bookman Old Style"/>
+          <w:sz w:val="20"/>
+          <w:szCs w:val="20"/>
+        </w:rPr>
+        <w:t>(</w:t>
+      </w:r>
+      <w:proofErr w:type="spellStart"/>
+      <w:proofErr w:type="gramEnd"/>
+      <w:r>
+        <w:rPr>
+          <w:rFonts w:ascii="Bookman Old Style" w:hAnsi="Bookman Old Style"/>
+          <w:sz w:val="20"/>
+          <w:szCs w:val="20"/>
+        </w:rPr>
+        <w:t>TripjackConstant.JSON_EXCEPTION_MESSAGE</w:t>
+      </w:r>
+      <w:proofErr w:type="spellEnd"/>
+      <w:r>
+        <w:rPr>
+          <w:rFonts w:ascii="Bookman Old Style" w:hAnsi="Bookman Old Style"/>
+          <w:sz w:val="20"/>
+          <w:szCs w:val="20"/>
+        </w:rPr>
+        <w:t xml:space="preserve"> + </w:t>
+      </w:r>
+      <w:proofErr w:type="spellStart"/>
+      <w:proofErr w:type="gramStart"/>
+      <w:r>
+        <w:rPr>
+          <w:rFonts w:ascii="Bookman Old Style" w:hAnsi="Bookman Old Style"/>
+          <w:sz w:val="20"/>
+          <w:szCs w:val="20"/>
+        </w:rPr>
+        <w:t>ex.getMessage</w:t>
+      </w:r>
+      <w:proofErr w:type="spellEnd"/>
+      <w:proofErr w:type="gramEnd"/>
+      <w:r>
+        <w:rPr>
+          <w:rFonts w:ascii="Bookman Old Style" w:hAnsi="Bookman Old Style"/>
+          <w:sz w:val="20"/>
+          <w:szCs w:val="20"/>
+        </w:rPr>
+        <w:t>(), ex</w:t>
+      </w:r>
+      <w:proofErr w:type="gramStart"/>
+      <w:r>
+        <w:rPr>
+          <w:rFonts w:ascii="Bookman Old Style" w:hAnsi="Bookman Old Style"/>
+          <w:sz w:val="20"/>
+          <w:szCs w:val="20"/>
+        </w:rPr>
+        <w:t>);</w:t>
+      </w:r>
+      <w:proofErr w:type="gramEnd"/>
+    </w:p>
+    <w:p>
+      <w:pPr>
+        <w:pStyle w:val="NoSpacing"/>
+        <w:rPr>
+          <w:rFonts w:ascii="Bookman Old Style" w:hAnsi="Bookman Old Style"/>
+        </w:rPr>
+      </w:pPr>
+      <w:r>
+        <w:rPr>
+          <w:rFonts w:ascii="Bookman Old Style" w:hAnsi="Bookman Old Style"/>
+        </w:rPr>
+        <w:t xml:space="preserve">    }</w:t>
+      </w:r>
+    </w:p>
+    <w:p>
+      <w:pPr>
+        <w:pStyle w:val="NoSpacing"/>
+        <w:rPr>
+          <w:rFonts w:ascii="Bookman Old Style" w:hAnsi="Bookman Old Style"/>
+        </w:rPr>
+      </w:pPr>
+      <w:r>
+        <w:rPr>
+          <w:rFonts w:ascii="Bookman Old Style" w:hAnsi="Bookman Old Style"/>
+        </w:rPr>
+        <w:t>}</w:t>
+      </w:r>
+    </w:p>
+    <w:p>
+      <w:pPr>
+        <w:pStyle w:val="NoSpacing"/>
+      </w:pPr>
+    </w:p>
+    <w:p>
+      <w:pPr>
+        <w:rPr>
+          <w:b/>
+          <w:bCs/>
+        </w:rPr>
+      </w:pPr>
+      <w:r>
+        <w:rPr>
+          <w:b/>
+          <w:bCs/>
+        </w:rPr>
+        <w:t>Summary of Benefits</w:t>
+      </w:r>
+    </w:p>
+    <w:p>
+      <w:pPr>
+        <w:numPr>
+          <w:ilvl w:val="0"/>
+          <w:numId w:val="37"/>
+        </w:numPr>
+      </w:pPr>
+      <w:r>
+        <w:rPr>
+          <w:b/>
+          <w:bCs/>
+        </w:rPr>
+        <w:t>Reduced Memory Footprint:</w:t>
+      </w:r>
+      <w:r>
+        <w:t xml:space="preserve"> You eliminated the String and </w:t>
+      </w:r>
+      <w:proofErr w:type="spellStart"/>
+      <w:r>
+        <w:t>JsonNode</w:t>
+      </w:r>
+      <w:proofErr w:type="spellEnd"/>
+      <w:r>
+        <w:t xml:space="preserve"> overhead.</w:t>
+      </w:r>
+    </w:p>
+    <w:p>
+      <w:pPr>
+        <w:numPr>
+          <w:ilvl w:val="0"/>
+          <w:numId w:val="37"/>
+        </w:numPr>
+      </w:pPr>
+      <w:r>
+        <w:rPr>
+          <w:b/>
+          <w:bCs/>
+        </w:rPr>
+        <w:t>Better GC Performance:</w:t>
+      </w:r>
+      <w:r>
+        <w:t xml:space="preserve"> Reusing the </w:t>
+      </w:r>
+      <w:proofErr w:type="spellStart"/>
+      <w:r>
+        <w:t>objectMapper</w:t>
+      </w:r>
+      <w:proofErr w:type="spellEnd"/>
+      <w:r>
+        <w:t xml:space="preserve"> means fewer objects are promoted to the "Old Gen" heap.</w:t>
+      </w:r>
+    </w:p>
+    <w:p>
+      <w:pPr>
+        <w:numPr>
+          <w:ilvl w:val="0"/>
+          <w:numId w:val="37"/>
+        </w:numPr>
+      </w:pPr>
+      <w:r>
+        <w:rPr>
+          <w:b/>
+          <w:bCs/>
+        </w:rPr>
+        <w:t>Cleaner Exception Handling:</w:t>
+      </w:r>
+      <w:r>
+        <w:t xml:space="preserve"> </w:t>
+      </w:r>
+      <w:proofErr w:type="spellStart"/>
+      <w:r>
+        <w:t>convertValue</w:t>
+      </w:r>
+      <w:proofErr w:type="spellEnd"/>
+      <w:r>
+        <w:t xml:space="preserve"> is easier to manage than catching </w:t>
+      </w:r>
+      <w:proofErr w:type="spellStart"/>
+      <w:r>
+        <w:t>JsonProcessingException</w:t>
+      </w:r>
+      <w:proofErr w:type="spellEnd"/>
+      <w:r>
+        <w:t xml:space="preserve"> across multiple lines.</w:t>
+      </w:r>
+    </w:p>
+    <w:p>
+      <w:r>
+        <w:rPr>
+          <w:b/>
+          <w:bCs/>
+        </w:rPr>
+        <w:t xml:space="preserve">A Note on </w:t>
+      </w:r>
+      <w:proofErr w:type="spellStart"/>
+      <w:r>
+        <w:rPr>
+          <w:b/>
+          <w:bCs/>
+        </w:rPr>
+        <w:t>FindSecBugs</w:t>
+      </w:r>
+      <w:proofErr w:type="spellEnd"/>
+      <w:r>
+        <w:rPr>
+          <w:b/>
+          <w:bCs/>
+        </w:rPr>
+        <w:t>:</w:t>
+      </w:r>
+      <w:r>
+        <w:t xml:space="preserve"> The analysis report you provided (rezair.fbwarnings.xml) actually flags similar mapping issues (e.g., BEAN_PROPERTY_INJECTION in </w:t>
+      </w:r>
+      <w:proofErr w:type="spellStart"/>
+      <w:r>
+        <w:t>TravellersInformationRequestMapper</w:t>
+      </w:r>
+      <w:proofErr w:type="spellEnd"/>
+      <w:r>
+        <w:t xml:space="preserve">) where manual or automated property copying can be risky. By switching to a strictly defined </w:t>
+      </w:r>
+      <w:proofErr w:type="spellStart"/>
+      <w:r>
+        <w:t>objectMapper</w:t>
+      </w:r>
+      <w:proofErr w:type="spellEnd"/>
+      <w:r>
+        <w:t xml:space="preserve"> or manual setters, you also improve the security posture of your mappers.</w:t>
+      </w:r>
     </w:p>
     <w:p>
       <w:pPr>
@@ -23342,6 +26761,155 @@
     </w:lvl>
   </w:abstractNum>
   <w:abstractNum w:abstractNumId="19" w15:restartNumberingAfterBreak="0">
+    <w:nsid w:val="3C856C8A"/>
+    <w:multiLevelType w:val="multilevel"/>
+    <w:tmpl w:val="63F8C022"/>
+    <w:lvl w:ilvl="0">
+      <w:start w:val="1"/>
+      <w:numFmt w:val="bullet"/>
+      <w:lvlText w:val=""/>
+      <w:lvlJc w:val="left"/>
+      <w:pPr>
+        <w:tabs>
+          <w:tab w:val="num" w:pos="720"/>
+        </w:tabs>
+        <w:ind w:left="720" w:hanging="360"/>
+      </w:pPr>
+      <w:rPr>
+        <w:rFonts w:ascii="Symbol" w:hAnsi="Symbol" w:hint="default"/>
+        <w:sz w:val="20"/>
+      </w:rPr>
+    </w:lvl>
+    <w:lvl w:ilvl="1" w:tentative="1">
+      <w:start w:val="1"/>
+      <w:numFmt w:val="bullet"/>
+      <w:lvlText w:val="o"/>
+      <w:lvlJc w:val="left"/>
+      <w:pPr>
+        <w:tabs>
+          <w:tab w:val="num" w:pos="1440"/>
+        </w:tabs>
+        <w:ind w:left="1440" w:hanging="360"/>
+      </w:pPr>
+      <w:rPr>
+        <w:rFonts w:ascii="Courier New" w:hAnsi="Courier New" w:hint="default"/>
+        <w:sz w:val="20"/>
+      </w:rPr>
+    </w:lvl>
+    <w:lvl w:ilvl="2" w:tentative="1">
+      <w:start w:val="1"/>
+      <w:numFmt w:val="bullet"/>
+      <w:lvlText w:val=""/>
+      <w:lvlJc w:val="left"/>
+      <w:pPr>
+        <w:tabs>
+          <w:tab w:val="num" w:pos="2160"/>
+        </w:tabs>
+        <w:ind w:left="2160" w:hanging="360"/>
+      </w:pPr>
+      <w:rPr>
+        <w:rFonts w:ascii="Wingdings" w:hAnsi="Wingdings" w:hint="default"/>
+        <w:sz w:val="20"/>
+      </w:rPr>
+    </w:lvl>
+    <w:lvl w:ilvl="3" w:tentative="1">
+      <w:start w:val="1"/>
+      <w:numFmt w:val="bullet"/>
+      <w:lvlText w:val=""/>
+      <w:lvlJc w:val="left"/>
+      <w:pPr>
+        <w:tabs>
+          <w:tab w:val="num" w:pos="2880"/>
+        </w:tabs>
+        <w:ind w:left="2880" w:hanging="360"/>
+      </w:pPr>
+      <w:rPr>
+        <w:rFonts w:ascii="Wingdings" w:hAnsi="Wingdings" w:hint="default"/>
+        <w:sz w:val="20"/>
+      </w:rPr>
+    </w:lvl>
+    <w:lvl w:ilvl="4" w:tentative="1">
+      <w:start w:val="1"/>
+      <w:numFmt w:val="bullet"/>
+      <w:lvlText w:val=""/>
+      <w:lvlJc w:val="left"/>
+      <w:pPr>
+        <w:tabs>
+          <w:tab w:val="num" w:pos="3600"/>
+        </w:tabs>
+        <w:ind w:left="3600" w:hanging="360"/>
+      </w:pPr>
+      <w:rPr>
+        <w:rFonts w:ascii="Wingdings" w:hAnsi="Wingdings" w:hint="default"/>
+        <w:sz w:val="20"/>
+      </w:rPr>
+    </w:lvl>
+    <w:lvl w:ilvl="5" w:tentative="1">
+      <w:start w:val="1"/>
+      <w:numFmt w:val="bullet"/>
+      <w:lvlText w:val=""/>
+      <w:lvlJc w:val="left"/>
+      <w:pPr>
+        <w:tabs>
+          <w:tab w:val="num" w:pos="4320"/>
+        </w:tabs>
+        <w:ind w:left="4320" w:hanging="360"/>
+      </w:pPr>
+      <w:rPr>
+        <w:rFonts w:ascii="Wingdings" w:hAnsi="Wingdings" w:hint="default"/>
+        <w:sz w:val="20"/>
+      </w:rPr>
+    </w:lvl>
+    <w:lvl w:ilvl="6" w:tentative="1">
+      <w:start w:val="1"/>
+      <w:numFmt w:val="bullet"/>
+      <w:lvlText w:val=""/>
+      <w:lvlJc w:val="left"/>
+      <w:pPr>
+        <w:tabs>
+          <w:tab w:val="num" w:pos="5040"/>
+        </w:tabs>
+        <w:ind w:left="5040" w:hanging="360"/>
+      </w:pPr>
+      <w:rPr>
+        <w:rFonts w:ascii="Wingdings" w:hAnsi="Wingdings" w:hint="default"/>
+        <w:sz w:val="20"/>
+      </w:rPr>
+    </w:lvl>
+    <w:lvl w:ilvl="7" w:tentative="1">
+      <w:start w:val="1"/>
+      <w:numFmt w:val="bullet"/>
+      <w:lvlText w:val=""/>
+      <w:lvlJc w:val="left"/>
+      <w:pPr>
+        <w:tabs>
+          <w:tab w:val="num" w:pos="5760"/>
+        </w:tabs>
+        <w:ind w:left="5760" w:hanging="360"/>
+      </w:pPr>
+      <w:rPr>
+        <w:rFonts w:ascii="Wingdings" w:hAnsi="Wingdings" w:hint="default"/>
+        <w:sz w:val="20"/>
+      </w:rPr>
+    </w:lvl>
+    <w:lvl w:ilvl="8" w:tentative="1">
+      <w:start w:val="1"/>
+      <w:numFmt w:val="bullet"/>
+      <w:lvlText w:val=""/>
+      <w:lvlJc w:val="left"/>
+      <w:pPr>
+        <w:tabs>
+          <w:tab w:val="num" w:pos="6480"/>
+        </w:tabs>
+        <w:ind w:left="6480" w:hanging="360"/>
+      </w:pPr>
+      <w:rPr>
+        <w:rFonts w:ascii="Wingdings" w:hAnsi="Wingdings" w:hint="default"/>
+        <w:sz w:val="20"/>
+      </w:rPr>
+    </w:lvl>
+  </w:abstractNum>
+  <w:abstractNum w:abstractNumId="20" w15:restartNumberingAfterBreak="0">
     <w:nsid w:val="410472EA"/>
     <w:multiLevelType w:val="multilevel"/>
     <w:tmpl w:val="9BACA4FC"/>
@@ -23490,7 +27058,7 @@
       </w:rPr>
     </w:lvl>
   </w:abstractNum>
-  <w:abstractNum w:abstractNumId="20" w15:restartNumberingAfterBreak="0">
+  <w:abstractNum w:abstractNumId="21" w15:restartNumberingAfterBreak="0">
     <w:nsid w:val="457155BC"/>
     <w:multiLevelType w:val="multilevel"/>
     <w:tmpl w:val="A42C9F18"/>
@@ -23639,7 +27207,7 @@
       </w:rPr>
     </w:lvl>
   </w:abstractNum>
-  <w:abstractNum w:abstractNumId="21" w15:restartNumberingAfterBreak="0">
+  <w:abstractNum w:abstractNumId="22" w15:restartNumberingAfterBreak="0">
     <w:nsid w:val="4AD47006"/>
     <w:multiLevelType w:val="multilevel"/>
     <w:tmpl w:val="D3E48C5A"/>
@@ -23752,7 +27320,7 @@
       </w:pPr>
     </w:lvl>
   </w:abstractNum>
-  <w:abstractNum w:abstractNumId="22" w15:restartNumberingAfterBreak="0">
+  <w:abstractNum w:abstractNumId="23" w15:restartNumberingAfterBreak="0">
     <w:nsid w:val="4BC74BE9"/>
     <w:multiLevelType w:val="hybridMultilevel"/>
     <w:tmpl w:val="C388AADC"/>
@@ -23865,7 +27433,7 @@
       </w:rPr>
     </w:lvl>
   </w:abstractNum>
-  <w:abstractNum w:abstractNumId="23" w15:restartNumberingAfterBreak="0">
+  <w:abstractNum w:abstractNumId="24" w15:restartNumberingAfterBreak="0">
     <w:nsid w:val="4ED635FE"/>
     <w:multiLevelType w:val="multilevel"/>
     <w:tmpl w:val="29EA5578"/>
@@ -24014,7 +27582,7 @@
       </w:rPr>
     </w:lvl>
   </w:abstractNum>
-  <w:abstractNum w:abstractNumId="24" w15:restartNumberingAfterBreak="0">
+  <w:abstractNum w:abstractNumId="25" w15:restartNumberingAfterBreak="0">
     <w:nsid w:val="4F000534"/>
     <w:multiLevelType w:val="multilevel"/>
     <w:tmpl w:val="7840A7AC"/>
@@ -24163,7 +27731,7 @@
       </w:rPr>
     </w:lvl>
   </w:abstractNum>
-  <w:abstractNum w:abstractNumId="25" w15:restartNumberingAfterBreak="0">
+  <w:abstractNum w:abstractNumId="26" w15:restartNumberingAfterBreak="0">
     <w:nsid w:val="550867CD"/>
     <w:multiLevelType w:val="multilevel"/>
     <w:tmpl w:val="D3C6FA68"/>
@@ -24312,7 +27880,7 @@
       </w:rPr>
     </w:lvl>
   </w:abstractNum>
-  <w:abstractNum w:abstractNumId="26" w15:restartNumberingAfterBreak="0">
+  <w:abstractNum w:abstractNumId="27" w15:restartNumberingAfterBreak="0">
     <w:nsid w:val="55EB69EE"/>
     <w:multiLevelType w:val="multilevel"/>
     <w:tmpl w:val="53149504"/>
@@ -24461,7 +28029,7 @@
       </w:rPr>
     </w:lvl>
   </w:abstractNum>
-  <w:abstractNum w:abstractNumId="27" w15:restartNumberingAfterBreak="0">
+  <w:abstractNum w:abstractNumId="28" w15:restartNumberingAfterBreak="0">
     <w:nsid w:val="5C3D5840"/>
     <w:multiLevelType w:val="multilevel"/>
     <w:tmpl w:val="9CF617A8"/>
@@ -24610,7 +28178,7 @@
       </w:rPr>
     </w:lvl>
   </w:abstractNum>
-  <w:abstractNum w:abstractNumId="28" w15:restartNumberingAfterBreak="0">
+  <w:abstractNum w:abstractNumId="29" w15:restartNumberingAfterBreak="0">
     <w:nsid w:val="61FA7819"/>
     <w:multiLevelType w:val="multilevel"/>
     <w:tmpl w:val="310E4AAA"/>
@@ -24759,7 +28327,7 @@
       </w:rPr>
     </w:lvl>
   </w:abstractNum>
-  <w:abstractNum w:abstractNumId="29" w15:restartNumberingAfterBreak="0">
+  <w:abstractNum w:abstractNumId="30" w15:restartNumberingAfterBreak="0">
     <w:nsid w:val="62575C7C"/>
     <w:multiLevelType w:val="multilevel"/>
     <w:tmpl w:val="B3987848"/>
@@ -24908,7 +28476,156 @@
       </w:rPr>
     </w:lvl>
   </w:abstractNum>
-  <w:abstractNum w:abstractNumId="30" w15:restartNumberingAfterBreak="0">
+  <w:abstractNum w:abstractNumId="31" w15:restartNumberingAfterBreak="0">
+    <w:nsid w:val="65E25B4F"/>
+    <w:multiLevelType w:val="multilevel"/>
+    <w:tmpl w:val="76003F9A"/>
+    <w:lvl w:ilvl="0">
+      <w:start w:val="1"/>
+      <w:numFmt w:val="bullet"/>
+      <w:lvlText w:val=""/>
+      <w:lvlJc w:val="left"/>
+      <w:pPr>
+        <w:tabs>
+          <w:tab w:val="num" w:pos="720"/>
+        </w:tabs>
+        <w:ind w:left="720" w:hanging="360"/>
+      </w:pPr>
+      <w:rPr>
+        <w:rFonts w:ascii="Symbol" w:hAnsi="Symbol" w:hint="default"/>
+        <w:sz w:val="20"/>
+      </w:rPr>
+    </w:lvl>
+    <w:lvl w:ilvl="1" w:tentative="1">
+      <w:start w:val="1"/>
+      <w:numFmt w:val="bullet"/>
+      <w:lvlText w:val="o"/>
+      <w:lvlJc w:val="left"/>
+      <w:pPr>
+        <w:tabs>
+          <w:tab w:val="num" w:pos="1440"/>
+        </w:tabs>
+        <w:ind w:left="1440" w:hanging="360"/>
+      </w:pPr>
+      <w:rPr>
+        <w:rFonts w:ascii="Courier New" w:hAnsi="Courier New" w:hint="default"/>
+        <w:sz w:val="20"/>
+      </w:rPr>
+    </w:lvl>
+    <w:lvl w:ilvl="2" w:tentative="1">
+      <w:start w:val="1"/>
+      <w:numFmt w:val="bullet"/>
+      <w:lvlText w:val=""/>
+      <w:lvlJc w:val="left"/>
+      <w:pPr>
+        <w:tabs>
+          <w:tab w:val="num" w:pos="2160"/>
+        </w:tabs>
+        <w:ind w:left="2160" w:hanging="360"/>
+      </w:pPr>
+      <w:rPr>
+        <w:rFonts w:ascii="Wingdings" w:hAnsi="Wingdings" w:hint="default"/>
+        <w:sz w:val="20"/>
+      </w:rPr>
+    </w:lvl>
+    <w:lvl w:ilvl="3" w:tentative="1">
+      <w:start w:val="1"/>
+      <w:numFmt w:val="bullet"/>
+      <w:lvlText w:val=""/>
+      <w:lvlJc w:val="left"/>
+      <w:pPr>
+        <w:tabs>
+          <w:tab w:val="num" w:pos="2880"/>
+        </w:tabs>
+        <w:ind w:left="2880" w:hanging="360"/>
+      </w:pPr>
+      <w:rPr>
+        <w:rFonts w:ascii="Wingdings" w:hAnsi="Wingdings" w:hint="default"/>
+        <w:sz w:val="20"/>
+      </w:rPr>
+    </w:lvl>
+    <w:lvl w:ilvl="4" w:tentative="1">
+      <w:start w:val="1"/>
+      <w:numFmt w:val="bullet"/>
+      <w:lvlText w:val=""/>
+      <w:lvlJc w:val="left"/>
+      <w:pPr>
+        <w:tabs>
+          <w:tab w:val="num" w:pos="3600"/>
+        </w:tabs>
+        <w:ind w:left="3600" w:hanging="360"/>
+      </w:pPr>
+      <w:rPr>
+        <w:rFonts w:ascii="Wingdings" w:hAnsi="Wingdings" w:hint="default"/>
+        <w:sz w:val="20"/>
+      </w:rPr>
+    </w:lvl>
+    <w:lvl w:ilvl="5" w:tentative="1">
+      <w:start w:val="1"/>
+      <w:numFmt w:val="bullet"/>
+      <w:lvlText w:val=""/>
+      <w:lvlJc w:val="left"/>
+      <w:pPr>
+        <w:tabs>
+          <w:tab w:val="num" w:pos="4320"/>
+        </w:tabs>
+        <w:ind w:left="4320" w:hanging="360"/>
+      </w:pPr>
+      <w:rPr>
+        <w:rFonts w:ascii="Wingdings" w:hAnsi="Wingdings" w:hint="default"/>
+        <w:sz w:val="20"/>
+      </w:rPr>
+    </w:lvl>
+    <w:lvl w:ilvl="6" w:tentative="1">
+      <w:start w:val="1"/>
+      <w:numFmt w:val="bullet"/>
+      <w:lvlText w:val=""/>
+      <w:lvlJc w:val="left"/>
+      <w:pPr>
+        <w:tabs>
+          <w:tab w:val="num" w:pos="5040"/>
+        </w:tabs>
+        <w:ind w:left="5040" w:hanging="360"/>
+      </w:pPr>
+      <w:rPr>
+        <w:rFonts w:ascii="Wingdings" w:hAnsi="Wingdings" w:hint="default"/>
+        <w:sz w:val="20"/>
+      </w:rPr>
+    </w:lvl>
+    <w:lvl w:ilvl="7" w:tentative="1">
+      <w:start w:val="1"/>
+      <w:numFmt w:val="bullet"/>
+      <w:lvlText w:val=""/>
+      <w:lvlJc w:val="left"/>
+      <w:pPr>
+        <w:tabs>
+          <w:tab w:val="num" w:pos="5760"/>
+        </w:tabs>
+        <w:ind w:left="5760" w:hanging="360"/>
+      </w:pPr>
+      <w:rPr>
+        <w:rFonts w:ascii="Wingdings" w:hAnsi="Wingdings" w:hint="default"/>
+        <w:sz w:val="20"/>
+      </w:rPr>
+    </w:lvl>
+    <w:lvl w:ilvl="8" w:tentative="1">
+      <w:start w:val="1"/>
+      <w:numFmt w:val="bullet"/>
+      <w:lvlText w:val=""/>
+      <w:lvlJc w:val="left"/>
+      <w:pPr>
+        <w:tabs>
+          <w:tab w:val="num" w:pos="6480"/>
+        </w:tabs>
+        <w:ind w:left="6480" w:hanging="360"/>
+      </w:pPr>
+      <w:rPr>
+        <w:rFonts w:ascii="Wingdings" w:hAnsi="Wingdings" w:hint="default"/>
+        <w:sz w:val="20"/>
+      </w:rPr>
+    </w:lvl>
+  </w:abstractNum>
+  <w:abstractNum w:abstractNumId="32" w15:restartNumberingAfterBreak="0">
     <w:nsid w:val="69390359"/>
     <w:multiLevelType w:val="multilevel"/>
     <w:tmpl w:val="321E219E"/>
@@ -25057,7 +28774,7 @@
       </w:rPr>
     </w:lvl>
   </w:abstractNum>
-  <w:abstractNum w:abstractNumId="31" w15:restartNumberingAfterBreak="0">
+  <w:abstractNum w:abstractNumId="33" w15:restartNumberingAfterBreak="0">
     <w:nsid w:val="74814D21"/>
     <w:multiLevelType w:val="multilevel"/>
     <w:tmpl w:val="55C28D7A"/>
@@ -25206,7 +28923,7 @@
       </w:rPr>
     </w:lvl>
   </w:abstractNum>
-  <w:abstractNum w:abstractNumId="32" w15:restartNumberingAfterBreak="0">
+  <w:abstractNum w:abstractNumId="34" w15:restartNumberingAfterBreak="0">
     <w:nsid w:val="76AA3A9B"/>
     <w:multiLevelType w:val="hybridMultilevel"/>
     <w:tmpl w:val="023C33BC"/>
@@ -25319,7 +29036,7 @@
       </w:rPr>
     </w:lvl>
   </w:abstractNum>
-  <w:abstractNum w:abstractNumId="33" w15:restartNumberingAfterBreak="0">
+  <w:abstractNum w:abstractNumId="35" w15:restartNumberingAfterBreak="0">
     <w:nsid w:val="775C627A"/>
     <w:multiLevelType w:val="multilevel"/>
     <w:tmpl w:val="69E01BB2"/>
@@ -25468,7 +29185,7 @@
       </w:rPr>
     </w:lvl>
   </w:abstractNum>
-  <w:abstractNum w:abstractNumId="34" w15:restartNumberingAfterBreak="0">
+  <w:abstractNum w:abstractNumId="36" w15:restartNumberingAfterBreak="0">
     <w:nsid w:val="78E06C6C"/>
     <w:multiLevelType w:val="multilevel"/>
     <w:tmpl w:val="76C25724"/>
@@ -25618,61 +29335,61 @@
     </w:lvl>
   </w:abstractNum>
   <w:num w:numId="1" w16cid:durableId="1422264094">
-    <w:abstractNumId w:val="24"/>
+    <w:abstractNumId w:val="25"/>
   </w:num>
   <w:num w:numId="2" w16cid:durableId="1505897374">
     <w:abstractNumId w:val="13"/>
   </w:num>
   <w:num w:numId="3" w16cid:durableId="37247446">
-    <w:abstractNumId w:val="21"/>
+    <w:abstractNumId w:val="22"/>
   </w:num>
   <w:num w:numId="4" w16cid:durableId="1986281108">
-    <w:abstractNumId w:val="19"/>
+    <w:abstractNumId w:val="20"/>
   </w:num>
   <w:num w:numId="5" w16cid:durableId="1712412173">
+    <w:abstractNumId w:val="29"/>
+  </w:num>
+  <w:num w:numId="6" w16cid:durableId="37095336">
+    <w:abstractNumId w:val="33"/>
+  </w:num>
+  <w:num w:numId="7" w16cid:durableId="2132478111">
     <w:abstractNumId w:val="28"/>
   </w:num>
-  <w:num w:numId="6" w16cid:durableId="37095336">
-    <w:abstractNumId w:val="31"/>
-  </w:num>
-  <w:num w:numId="7" w16cid:durableId="2132478111">
-    <w:abstractNumId w:val="27"/>
-  </w:num>
   <w:num w:numId="8" w16cid:durableId="36007492">
-    <w:abstractNumId w:val="29"/>
+    <w:abstractNumId w:val="30"/>
   </w:num>
   <w:num w:numId="9" w16cid:durableId="1485783266">
     <w:abstractNumId w:val="1"/>
   </w:num>
   <w:num w:numId="10" w16cid:durableId="400833116">
-    <w:abstractNumId w:val="23"/>
+    <w:abstractNumId w:val="24"/>
   </w:num>
   <w:num w:numId="11" w16cid:durableId="1481380801">
     <w:abstractNumId w:val="6"/>
   </w:num>
   <w:num w:numId="12" w16cid:durableId="964387713">
-    <w:abstractNumId w:val="34"/>
+    <w:abstractNumId w:val="36"/>
   </w:num>
   <w:num w:numId="13" w16cid:durableId="1879079296">
     <w:abstractNumId w:val="3"/>
   </w:num>
   <w:num w:numId="14" w16cid:durableId="1663191917">
-    <w:abstractNumId w:val="33"/>
+    <w:abstractNumId w:val="35"/>
   </w:num>
   <w:num w:numId="15" w16cid:durableId="415709856">
     <w:abstractNumId w:val="7"/>
   </w:num>
   <w:num w:numId="16" w16cid:durableId="1773738354">
-    <w:abstractNumId w:val="20"/>
+    <w:abstractNumId w:val="21"/>
   </w:num>
   <w:num w:numId="17" w16cid:durableId="854421692">
-    <w:abstractNumId w:val="26"/>
+    <w:abstractNumId w:val="27"/>
   </w:num>
   <w:num w:numId="18" w16cid:durableId="791745829">
     <w:abstractNumId w:val="15"/>
   </w:num>
   <w:num w:numId="19" w16cid:durableId="408236825">
-    <w:abstractNumId w:val="25"/>
+    <w:abstractNumId w:val="26"/>
   </w:num>
   <w:num w:numId="20" w16cid:durableId="822619737">
     <w:abstractNumId w:val="2"/>
@@ -25684,13 +29401,13 @@
     <w:abstractNumId w:val="8"/>
   </w:num>
   <w:num w:numId="23" w16cid:durableId="1178734925">
-    <w:abstractNumId w:val="32"/>
+    <w:abstractNumId w:val="34"/>
   </w:num>
   <w:num w:numId="24" w16cid:durableId="1187216713">
     <w:abstractNumId w:val="18"/>
   </w:num>
   <w:num w:numId="25" w16cid:durableId="840655019">
-    <w:abstractNumId w:val="22"/>
+    <w:abstractNumId w:val="23"/>
   </w:num>
   <w:num w:numId="26" w16cid:durableId="777214815">
     <w:abstractNumId w:val="4"/>
@@ -25717,10 +29434,16 @@
     <w:abstractNumId w:val="14"/>
   </w:num>
   <w:num w:numId="34" w16cid:durableId="356930006">
-    <w:abstractNumId w:val="30"/>
+    <w:abstractNumId w:val="32"/>
   </w:num>
   <w:num w:numId="35" w16cid:durableId="73940752">
     <w:abstractNumId w:val="11"/>
+  </w:num>
+  <w:num w:numId="36" w16cid:durableId="965696483">
+    <w:abstractNumId w:val="19"/>
+  </w:num>
+  <w:num w:numId="37" w16cid:durableId="839320275">
+    <w:abstractNumId w:val="31"/>
   </w:num>
 </w:numbering>
 </file>

</xml_diff>